<commit_message>
Add final scores export and docs
</commit_message>
<xml_diff>
--- a/Entregables_pt_app/02_funciones_usadas/README.docx
+++ b/Entregables_pt_app/02_funciones_usadas/README.docx
@@ -2,13 +2,13 @@
 <file path=word/document.xml><?xml version="1.0" encoding="utf-8"?>
 <w:document xmlns:w="http://schemas.openxmlformats.org/wordprocessingml/2006/main" xmlns:m="http://schemas.openxmlformats.org/officeDocument/2006/math" xmlns:r="http://schemas.openxmlformats.org/officeDocument/2006/relationships" xmlns:o="urn:schemas-microsoft-com:office:office" xmlns:v="urn:schemas-microsoft-com:vml" xmlns:w10="urn:schemas-microsoft-com:office:word" xmlns:a="http://schemas.openxmlformats.org/drawingml/2006/main" xmlns:pic="http://schemas.openxmlformats.org/drawingml/2006/picture" xmlns:wp="http://schemas.openxmlformats.org/drawingml/2006/wordprocessingDrawing">
   <w:body>
-    <w:bookmarkStart w:id="26" w:name="X20bb20d5794b120dd54ab41efd6c7a7920e4751"/>
+    <w:bookmarkStart w:id="26" w:name="X8b96b972d6acd87e7ed429bb3953bbf4dac4d8f"/>
     <w:p>
       <w:pPr>
         <w:pStyle w:val="Heading1"/>
       </w:pPr>
       <w:r>
-        <w:t xml:space="preserve">Entregable 02 - Funciones Usadas en app.R y reports/</w:t>
+        <w:t xml:space="preserve">Entregable 02 - Funciones Usadas en app.R, R/ y ptcalc/R/</w:t>
       </w:r>
     </w:p>
     <w:p>
@@ -26,7 +26,7 @@
         <w:t xml:space="preserve"> </w:t>
       </w:r>
       <w:r>
-        <w:t xml:space="preserve">1 - Fundación</w:t>
+        <w:t xml:space="preserve">1 - Fundacion</w:t>
       </w:r>
       <w:r>
         <w:br/>
@@ -36,7 +36,7 @@
           <w:b/>
           <w:bCs/>
         </w:rPr>
-        <w:t xml:space="preserve">Fecha de creación:</w:t>
+        <w:t xml:space="preserve">Fecha de creacion:</w:t>
       </w:r>
       <w:r>
         <w:t xml:space="preserve"> </w:t>
@@ -52,13 +52,29 @@
           <w:b/>
           <w:bCs/>
         </w:rPr>
+        <w:t xml:space="preserve">Fecha de regeneracion:</w:t>
+      </w:r>
+      <w:r>
+        <w:t xml:space="preserve"> </w:t>
+      </w:r>
+      <w:r>
+        <w:t xml:space="preserve">2026-06-16</w:t>
+      </w:r>
+      <w:r>
+        <w:br/>
+      </w:r>
+      <w:r>
+        <w:rPr>
+          <w:b/>
+          <w:bCs/>
+        </w:rPr>
         <w:t xml:space="preserve">Estado:</w:t>
       </w:r>
       <w:r>
         <w:t xml:space="preserve"> </w:t>
       </w:r>
       <w:r>
-        <w:t xml:space="preserve">Completado</w:t>
+        <w:t xml:space="preserve">Regenerado y enriquecido</w:t>
       </w:r>
     </w:p>
     <w:bookmarkStart w:id="9" w:name="objetivo"/>
@@ -75,17 +91,35 @@
         <w:pStyle w:val="FirstParagraph"/>
       </w:pPr>
       <w:r>
-        <w:t xml:space="preserve">Documentar todas las funciones disponibles en la aplicación con sus firmas, parámetros, tipos de retorno y referencias a estándares ISO.</w:t>
+        <w:t xml:space="preserve">Documentar todas las funciones disponibles en la aplicacion con sus firmas,</w:t>
+      </w:r>
+      <w:r>
+        <w:t xml:space="preserve"> </w:t>
+      </w:r>
+      <w:r>
+        <w:t xml:space="preserve">parametros, tipos de retorno, ejemplos, referencias ISO y trazabilidad al archivo</w:t>
+      </w:r>
+      <w:r>
+        <w:t xml:space="preserve"> </w:t>
+      </w:r>
+      <w:r>
+        <w:t xml:space="preserve">fuente. Este entregable es la referencia tecnica del API interno del aplicativo</w:t>
+      </w:r>
+      <w:r>
+        <w:t xml:space="preserve"> </w:t>
+      </w:r>
+      <w:r>
+        <w:t xml:space="preserve">PT App.</w:t>
       </w:r>
     </w:p>
     <w:bookmarkEnd w:id="9"/>
-    <w:bookmarkStart w:id="10" w:name="descripción"/>
+    <w:bookmarkStart w:id="10" w:name="descripcion"/>
     <w:p>
       <w:pPr>
         <w:pStyle w:val="Heading2"/>
       </w:pPr>
       <w:r>
-        <w:t xml:space="preserve">Descripción</w:t>
+        <w:t xml:space="preserve">Descripcion</w:t>
       </w:r>
     </w:p>
     <w:p>
@@ -95,11 +129,17 @@
       <w:r>
         <w:t xml:space="preserve">Este entregable contiene:</w:t>
       </w:r>
-      <w:r>
-        <w:t xml:space="preserve"> </w:t>
-      </w:r>
-      <w:r>
-        <w:t xml:space="preserve">- Inventario completo de funciones en</w:t>
+    </w:p>
+    <w:p>
+      <w:pPr>
+        <w:pStyle w:val="Compact"/>
+        <w:numPr>
+          <w:ilvl w:val="0"/>
+          <w:numId w:val="1001"/>
+        </w:numPr>
+      </w:pPr>
+      <w:r>
+        <w:t xml:space="preserve">Inventario completo de funciones en</w:t>
       </w:r>
       <w:r>
         <w:t xml:space="preserve"> </w:t>
@@ -123,6 +163,18 @@
         <w:t xml:space="preserve">R/</w:t>
       </w:r>
       <w:r>
+        <w:t xml:space="preserve">,</w:t>
+      </w:r>
+      <w:r>
+        <w:t xml:space="preserve"> </w:t>
+      </w:r>
+      <w:r>
+        <w:rPr>
+          <w:rStyle w:val="VerbatimChar"/>
+        </w:rPr>
+        <w:t xml:space="preserve">ptcalc/R/</w:t>
+      </w:r>
+      <w:r>
         <w:t xml:space="preserve"> </w:t>
       </w:r>
       <w:r>
@@ -135,19 +187,94 @@
         <w:rPr>
           <w:rStyle w:val="VerbatimChar"/>
         </w:rPr>
-        <w:t xml:space="preserve">reports/</w:t>
-      </w:r>
-      <w:r>
-        <w:t xml:space="preserve"> </w:t>
-      </w:r>
-      <w:r>
-        <w:t xml:space="preserve">- Documentación detallada de cada función</w:t>
-      </w:r>
-      <w:r>
-        <w:t xml:space="preserve"> </w:t>
-      </w:r>
-      <w:r>
-        <w:t xml:space="preserve">- Tests que verifican la ejecución correcta de las funciones</w:t>
+        <w:t xml:space="preserve">reports/report_template.Rmd</w:t>
+      </w:r>
+      <w:r>
+        <w:t xml:space="preserve">.</w:t>
+      </w:r>
+    </w:p>
+    <w:p>
+      <w:pPr>
+        <w:pStyle w:val="Compact"/>
+        <w:numPr>
+          <w:ilvl w:val="0"/>
+          <w:numId w:val="1001"/>
+        </w:numPr>
+      </w:pPr>
+      <w:r>
+        <w:t xml:space="preserve">Documentacion enriquecida en Markdown con categorias, descripciones,</w:t>
+      </w:r>
+      <w:r>
+        <w:t xml:space="preserve"> </w:t>
+      </w:r>
+      <w:r>
+        <w:t xml:space="preserve">parametros, valores de retorno, ejemplos y referencias ISO.</w:t>
+      </w:r>
+    </w:p>
+    <w:p>
+      <w:pPr>
+        <w:pStyle w:val="Compact"/>
+        <w:numPr>
+          <w:ilvl w:val="0"/>
+          <w:numId w:val="1001"/>
+        </w:numPr>
+      </w:pPr>
+      <w:r>
+        <w:t xml:space="preserve">Base de datos de firmas (</w:t>
+      </w:r>
+      <w:r>
+        <w:rPr>
+          <w:rStyle w:val="VerbatimChar"/>
+        </w:rPr>
+        <w:t xml:space="preserve">funciones_extraidas.csv</w:t>
+      </w:r>
+      <w:r>
+        <w:t xml:space="preserve">) para consumo automatizado.</w:t>
+      </w:r>
+    </w:p>
+    <w:p>
+      <w:pPr>
+        <w:pStyle w:val="Compact"/>
+        <w:numPr>
+          <w:ilvl w:val="0"/>
+          <w:numId w:val="1001"/>
+        </w:numPr>
+      </w:pPr>
+      <w:r>
+        <w:t xml:space="preserve">Script de extraccion (</w:t>
+      </w:r>
+      <w:r>
+        <w:rPr>
+          <w:rStyle w:val="VerbatimChar"/>
+        </w:rPr>
+        <w:t xml:space="preserve">R/lista_funciones.R</w:t>
+      </w:r>
+      <w:r>
+        <w:t xml:space="preserve">) que parsea bloques roxygen2</w:t>
+      </w:r>
+      <w:r>
+        <w:t xml:space="preserve"> </w:t>
+      </w:r>
+      <w:r>
+        <w:t xml:space="preserve">completos y fusiona anotaciones manuales para funciones internas sin</w:t>
+      </w:r>
+      <w:r>
+        <w:t xml:space="preserve"> </w:t>
+      </w:r>
+      <w:r>
+        <w:t xml:space="preserve">documentacion roxygen2.</w:t>
+      </w:r>
+    </w:p>
+    <w:p>
+      <w:pPr>
+        <w:pStyle w:val="Compact"/>
+        <w:numPr>
+          <w:ilvl w:val="0"/>
+          <w:numId w:val="1001"/>
+        </w:numPr>
+      </w:pPr>
+      <w:r>
+        <w:t xml:space="preserve">Tests que verifican la existencia y firma de las funciones documentadas.</w:t>
       </w:r>
     </w:p>
     <w:bookmarkEnd w:id="10"/>
@@ -194,18 +321,18 @@
               <w:pStyle w:val="Compact"/>
             </w:pPr>
             <w:r>
-              <w:t xml:space="preserve">Descripción</w:t>
-            </w:r>
-          </w:p>
-        </w:tc>
-        <w:tc>
-          <w:tcPr/>
-          <w:p>
-            <w:pPr>
-              <w:pStyle w:val="Compact"/>
-            </w:pPr>
-            <w:r>
-              <w:t xml:space="preserve">Ubicación</w:t>
+              <w:t xml:space="preserve">Descripcion</w:t>
+            </w:r>
+          </w:p>
+        </w:tc>
+        <w:tc>
+          <w:tcPr/>
+          <w:p>
+            <w:pPr>
+              <w:pStyle w:val="Compact"/>
+            </w:pPr>
+            <w:r>
+              <w:t xml:space="preserve">Ubicacion</w:t>
             </w:r>
           </w:p>
         </w:tc>
@@ -262,6 +389,47 @@
               <w:rPr>
                 <w:rStyle w:val="VerbatimChar"/>
               </w:rPr>
+              <w:t xml:space="preserve">README.docx</w:t>
+            </w:r>
+          </w:p>
+        </w:tc>
+        <w:tc>
+          <w:tcPr/>
+          <w:p>
+            <w:pPr>
+              <w:pStyle w:val="Compact"/>
+            </w:pPr>
+            <w:r>
+              <w:t xml:space="preserve">Version Word de este documento</w:t>
+            </w:r>
+          </w:p>
+        </w:tc>
+        <w:tc>
+          <w:tcPr/>
+          <w:p>
+            <w:pPr>
+              <w:pStyle w:val="Compact"/>
+            </w:pPr>
+            <w:r>
+              <w:rPr>
+                <w:rStyle w:val="VerbatimChar"/>
+              </w:rPr>
+              <w:t xml:space="preserve">/</w:t>
+            </w:r>
+          </w:p>
+        </w:tc>
+      </w:tr>
+      <w:tr>
+        <w:tc>
+          <w:tcPr/>
+          <w:p>
+            <w:pPr>
+              <w:pStyle w:val="Compact"/>
+            </w:pPr>
+            <w:r>
+              <w:rPr>
+                <w:rStyle w:val="VerbatimChar"/>
+              </w:rPr>
               <w:t xml:space="preserve">R/lista_funciones.R</w:t>
             </w:r>
           </w:p>
@@ -273,7 +441,7 @@
               <w:pStyle w:val="Compact"/>
             </w:pPr>
             <w:r>
-              <w:t xml:space="preserve">Script de extracción de firmas</w:t>
+              <w:t xml:space="preserve">Script extractor de firmas y generador de documentacion</w:t>
             </w:r>
           </w:p>
         </w:tc>
@@ -303,18 +471,18 @@
               <w:rPr>
                 <w:rStyle w:val="VerbatimChar"/>
               </w:rPr>
-              <w:t xml:space="preserve">md/funciones_extraidas.csv</w:t>
-            </w:r>
-          </w:p>
-        </w:tc>
-        <w:tc>
-          <w:tcPr/>
-          <w:p>
-            <w:pPr>
-              <w:pStyle w:val="Compact"/>
-            </w:pPr>
-            <w:r>
-              <w:t xml:space="preserve">Tabla con todas las funciones</w:t>
+              <w:t xml:space="preserve">md/documentacion_funciones.md</w:t>
+            </w:r>
+          </w:p>
+        </w:tc>
+        <w:tc>
+          <w:tcPr/>
+          <w:p>
+            <w:pPr>
+              <w:pStyle w:val="Compact"/>
+            </w:pPr>
+            <w:r>
+              <w:t xml:space="preserve">Documentacion enriquecida en Markdown</w:t>
             </w:r>
           </w:p>
         </w:tc>
@@ -344,18 +512,18 @@
               <w:rPr>
                 <w:rStyle w:val="VerbatimChar"/>
               </w:rPr>
-              <w:t xml:space="preserve">md/documentacion_funciones.md</w:t>
-            </w:r>
-          </w:p>
-        </w:tc>
-        <w:tc>
-          <w:tcPr/>
-          <w:p>
-            <w:pPr>
-              <w:pStyle w:val="Compact"/>
-            </w:pPr>
-            <w:r>
-              <w:t xml:space="preserve">Documentación en formato Markdown</w:t>
+              <w:t xml:space="preserve">documentacion_funciones.docx</w:t>
+            </w:r>
+          </w:p>
+        </w:tc>
+        <w:tc>
+          <w:tcPr/>
+          <w:p>
+            <w:pPr>
+              <w:pStyle w:val="Compact"/>
+            </w:pPr>
+            <w:r>
+              <w:t xml:space="preserve">Version Word de la documentacion</w:t>
             </w:r>
           </w:p>
         </w:tc>
@@ -369,7 +537,48 @@
               <w:rPr>
                 <w:rStyle w:val="VerbatimChar"/>
               </w:rPr>
-              <w:t xml:space="preserve">md/</w:t>
+              <w:t xml:space="preserve">/</w:t>
+            </w:r>
+          </w:p>
+        </w:tc>
+      </w:tr>
+      <w:tr>
+        <w:tc>
+          <w:tcPr/>
+          <w:p>
+            <w:pPr>
+              <w:pStyle w:val="Compact"/>
+            </w:pPr>
+            <w:r>
+              <w:rPr>
+                <w:rStyle w:val="VerbatimChar"/>
+              </w:rPr>
+              <w:t xml:space="preserve">funciones_extraidas.csv</w:t>
+            </w:r>
+          </w:p>
+        </w:tc>
+        <w:tc>
+          <w:tcPr/>
+          <w:p>
+            <w:pPr>
+              <w:pStyle w:val="Compact"/>
+            </w:pPr>
+            <w:r>
+              <w:t xml:space="preserve">Tabla con metadata de todas las funciones</w:t>
+            </w:r>
+          </w:p>
+        </w:tc>
+        <w:tc>
+          <w:tcPr/>
+          <w:p>
+            <w:pPr>
+              <w:pStyle w:val="Compact"/>
+            </w:pPr>
+            <w:r>
+              <w:rPr>
+                <w:rStyle w:val="VerbatimChar"/>
+              </w:rPr>
+              <w:t xml:space="preserve">/</w:t>
             </w:r>
           </w:p>
         </w:tc>
@@ -396,7 +605,7 @@
               <w:pStyle w:val="Compact"/>
             </w:pPr>
             <w:r>
-              <w:t xml:space="preserve">Tests de verificación</w:t>
+              <w:t xml:space="preserve">Tests de verificacion de firmas</w:t>
             </w:r>
           </w:p>
         </w:tc>
@@ -437,7 +646,7 @@
               <w:pStyle w:val="Compact"/>
             </w:pPr>
             <w:r>
-              <w:t xml:space="preserve">Guía de uso</w:t>
+              <w:t xml:space="preserve">Guia de uso de los tests</w:t>
             </w:r>
           </w:p>
         </w:tc>
@@ -456,9 +665,50 @@
           </w:p>
         </w:tc>
       </w:tr>
+      <w:tr>
+        <w:tc>
+          <w:tcPr/>
+          <w:p>
+            <w:pPr>
+              <w:pStyle w:val="Compact"/>
+            </w:pPr>
+            <w:r>
+              <w:rPr>
+                <w:rStyle w:val="VerbatimChar"/>
+              </w:rPr>
+              <w:t xml:space="preserve">test_02_resultados.csv</w:t>
+            </w:r>
+          </w:p>
+        </w:tc>
+        <w:tc>
+          <w:tcPr/>
+          <w:p>
+            <w:pPr>
+              <w:pStyle w:val="Compact"/>
+            </w:pPr>
+            <w:r>
+              <w:t xml:space="preserve">Bitacora de ejecucion de pruebas</w:t>
+            </w:r>
+          </w:p>
+        </w:tc>
+        <w:tc>
+          <w:tcPr/>
+          <w:p>
+            <w:pPr>
+              <w:pStyle w:val="Compact"/>
+            </w:pPr>
+            <w:r>
+              <w:rPr>
+                <w:rStyle w:val="VerbatimChar"/>
+              </w:rPr>
+              <w:t xml:space="preserve">/</w:t>
+            </w:r>
+          </w:p>
+        </w:tc>
+      </w:tr>
     </w:tbl>
     <w:bookmarkEnd w:id="11"/>
-    <w:bookmarkStart w:id="18" w:name="resumen-de-funciones-encontradas"/>
+    <w:bookmarkStart w:id="17" w:name="resumen-de-funciones-encontradas"/>
     <w:p>
       <w:pPr>
         <w:pStyle w:val="Heading2"/>
@@ -482,33 +732,682 @@
         <w:t xml:space="preserve"> </w:t>
       </w:r>
       <w:r>
-        <w:t xml:space="preserve">48 funciones únicas</w:t>
-      </w:r>
-    </w:p>
-    <w:bookmarkStart w:id="17" w:name="categorías"/>
+        <w:t xml:space="preserve">77 funciones unicas</w:t>
+      </w:r>
+    </w:p>
+    <w:p>
+      <w:pPr>
+        <w:pStyle w:val="BodyText"/>
+      </w:pPr>
+      <w:r>
+        <w:rPr>
+          <w:b/>
+          <w:bCs/>
+        </w:rPr>
+        <w:t xml:space="preserve">Funciones exportadas (</w:t>
+      </w:r>
+      <w:r>
+        <w:rPr>
+          <w:rStyle w:val="VerbatimChar"/>
+          <w:b/>
+          <w:bCs/>
+        </w:rPr>
+        <w:t xml:space="preserve">@export</w:t>
+      </w:r>
+      <w:r>
+        <w:rPr>
+          <w:b/>
+          <w:bCs/>
+        </w:rPr>
+        <w:t xml:space="preserve">):</w:t>
+      </w:r>
+      <w:r>
+        <w:t xml:space="preserve"> </w:t>
+      </w:r>
+      <w:r>
+        <w:t xml:space="preserve">24</w:t>
+      </w:r>
+      <w:r>
+        <w:br/>
+      </w:r>
+      <w:r>
+        <w:rPr>
+          <w:b/>
+          <w:bCs/>
+        </w:rPr>
+        <w:t xml:space="preserve">Funciones obsoletas (</w:t>
+      </w:r>
+      <w:r>
+        <w:rPr>
+          <w:rStyle w:val="VerbatimChar"/>
+          <w:b/>
+          <w:bCs/>
+        </w:rPr>
+        <w:t xml:space="preserve">lifecycle::badge("deprecated")</w:t>
+      </w:r>
+      <w:r>
+        <w:rPr>
+          <w:b/>
+          <w:bCs/>
+        </w:rPr>
+        <w:t xml:space="preserve">):</w:t>
+      </w:r>
+      <w:r>
+        <w:t xml:space="preserve"> </w:t>
+      </w:r>
+      <w:r>
+        <w:t xml:space="preserve">3</w:t>
+      </w:r>
+    </w:p>
+    <w:bookmarkStart w:id="12" w:name="categorias"/>
     <w:p>
       <w:pPr>
         <w:pStyle w:val="Heading3"/>
       </w:pPr>
       <w:r>
-        <w:t xml:space="preserve">Categorías</w:t>
-      </w:r>
-    </w:p>
-    <w:bookmarkStart w:id="12" w:name="estadísticas-de-homogeneidad"/>
+        <w:t xml:space="preserve">Categorias</w:t>
+      </w:r>
+    </w:p>
+    <w:tbl>
+      <w:tblPr>
+        <w:tblStyle w:val="Table"/>
+        <w:tblW w:type="pct" w:w="5000"/>
+        <w:tblLayout w:type="fixed"/>
+        <w:tblLook w:firstRow="1" w:lastRow="0" w:firstColumn="0" w:lastColumn="0" w:noHBand="0" w:noVBand="0" w:val="0020"/>
+      </w:tblPr>
+      <w:tblGrid>
+        <w:gridCol w:w="2420"/>
+        <w:gridCol w:w="2640"/>
+        <w:gridCol w:w="2860"/>
+      </w:tblGrid>
+      <w:tr>
+        <w:trPr>
+          <w:tblHeader w:val="on"/>
+        </w:trPr>
+        <w:tc>
+          <w:tcPr/>
+          <w:p>
+            <w:pPr>
+              <w:pStyle w:val="Compact"/>
+            </w:pPr>
+            <w:r>
+              <w:t xml:space="preserve">Categoria</w:t>
+            </w:r>
+          </w:p>
+        </w:tc>
+        <w:tc>
+          <w:tcPr/>
+          <w:p>
+            <w:pPr>
+              <w:pStyle w:val="Compact"/>
+              <w:jc w:val="right"/>
+            </w:pPr>
+            <w:r>
+              <w:t xml:space="preserve">Funciones</w:t>
+            </w:r>
+          </w:p>
+        </w:tc>
+        <w:tc>
+          <w:tcPr/>
+          <w:p>
+            <w:pPr>
+              <w:pStyle w:val="Compact"/>
+            </w:pPr>
+            <w:r>
+              <w:t xml:space="preserve">Descripcion</w:t>
+            </w:r>
+          </w:p>
+        </w:tc>
+      </w:tr>
+      <w:tr>
+        <w:tc>
+          <w:tcPr/>
+          <w:p>
+            <w:pPr>
+              <w:pStyle w:val="Compact"/>
+            </w:pPr>
+            <w:r>
+              <w:t xml:space="preserve">Estadisticos Robustos</w:t>
+            </w:r>
+          </w:p>
+        </w:tc>
+        <w:tc>
+          <w:tcPr/>
+          <w:p>
+            <w:pPr>
+              <w:pStyle w:val="Compact"/>
+              <w:jc w:val="right"/>
+            </w:pPr>
+            <w:r>
+              <w:t xml:space="preserve">6</w:t>
+            </w:r>
+          </w:p>
+        </w:tc>
+        <w:tc>
+          <w:tcPr/>
+          <w:p>
+            <w:pPr>
+              <w:pStyle w:val="Compact"/>
+            </w:pPr>
+            <w:r>
+              <w:t xml:space="preserve">nIQR, MADe, Algoritmo A y helpers de convergencia.</w:t>
+            </w:r>
+          </w:p>
+        </w:tc>
+      </w:tr>
+      <w:tr>
+        <w:tc>
+          <w:tcPr/>
+          <w:p>
+            <w:pPr>
+              <w:pStyle w:val="Compact"/>
+            </w:pPr>
+            <w:r>
+              <w:t xml:space="preserve">Homogeneidad y Estabilidad</w:t>
+            </w:r>
+          </w:p>
+        </w:tc>
+        <w:tc>
+          <w:tcPr/>
+          <w:p>
+            <w:pPr>
+              <w:pStyle w:val="Compact"/>
+              <w:jc w:val="right"/>
+            </w:pPr>
+            <w:r>
+              <w:t xml:space="preserve">15</w:t>
+            </w:r>
+          </w:p>
+        </w:tc>
+        <w:tc>
+          <w:tcPr/>
+          <w:p>
+            <w:pPr>
+              <w:pStyle w:val="Compact"/>
+            </w:pPr>
+            <w:r>
+              <w:t xml:space="preserve">Estadisticos ANOVA, criterios ISO, evaluacion y wrappers.</w:t>
+            </w:r>
+          </w:p>
+        </w:tc>
+      </w:tr>
+      <w:tr>
+        <w:tc>
+          <w:tcPr/>
+          <w:p>
+            <w:pPr>
+              <w:pStyle w:val="Compact"/>
+            </w:pPr>
+            <w:r>
+              <w:t xml:space="preserve">Puntajes PT</w:t>
+            </w:r>
+          </w:p>
+        </w:tc>
+        <w:tc>
+          <w:tcPr/>
+          <w:p>
+            <w:pPr>
+              <w:pStyle w:val="Compact"/>
+              <w:jc w:val="right"/>
+            </w:pPr>
+            <w:r>
+              <w:t xml:space="preserve">15</w:t>
+            </w:r>
+          </w:p>
+        </w:tc>
+        <w:tc>
+          <w:tcPr/>
+          <w:p>
+            <w:pPr>
+              <w:pStyle w:val="Compact"/>
+            </w:pPr>
+            <w:r>
+              <w:t xml:space="preserve">z, z’, zeta, En y funciones de evaluacion/clasificacion.</w:t>
+            </w:r>
+          </w:p>
+        </w:tc>
+      </w:tr>
+      <w:tr>
+        <w:tc>
+          <w:tcPr/>
+          <w:p>
+            <w:pPr>
+              <w:pStyle w:val="Compact"/>
+            </w:pPr>
+            <w:r>
+              <w:t xml:space="preserve">Carga y Normalizacion</w:t>
+            </w:r>
+          </w:p>
+        </w:tc>
+        <w:tc>
+          <w:tcPr/>
+          <w:p>
+            <w:pPr>
+              <w:pStyle w:val="Compact"/>
+              <w:jc w:val="right"/>
+            </w:pPr>
+            <w:r>
+              <w:t xml:space="preserve">8</w:t>
+            </w:r>
+          </w:p>
+        </w:tc>
+        <w:tc>
+          <w:tcPr/>
+          <w:p>
+            <w:pPr>
+              <w:pStyle w:val="Compact"/>
+            </w:pPr>
+            <w:r>
+              <w:t xml:space="preserve">Lectura de CSV, normalizacion de contaminantes, incertidumbres y n_lab.</w:t>
+            </w:r>
+          </w:p>
+        </w:tc>
+      </w:tr>
+      <w:tr>
+        <w:tc>
+          <w:tcPr/>
+          <w:p>
+            <w:pPr>
+              <w:pStyle w:val="Compact"/>
+            </w:pPr>
+            <w:r>
+              <w:t xml:space="preserve">Formateo</w:t>
+            </w:r>
+          </w:p>
+        </w:tc>
+        <w:tc>
+          <w:tcPr/>
+          <w:p>
+            <w:pPr>
+              <w:pStyle w:val="Compact"/>
+              <w:jc w:val="right"/>
+            </w:pPr>
+            <w:r>
+              <w:t xml:space="preserve">3</w:t>
+            </w:r>
+          </w:p>
+        </w:tc>
+        <w:tc>
+          <w:tcPr/>
+          <w:p>
+            <w:pPr>
+              <w:pStyle w:val="Compact"/>
+            </w:pPr>
+            <w:r>
+              <w:t xml:space="preserve">Formateo numerico y de etiquetas de convergencia.</w:t>
+            </w:r>
+          </w:p>
+        </w:tc>
+      </w:tr>
+      <w:tr>
+        <w:tc>
+          <w:tcPr/>
+          <w:p>
+            <w:pPr>
+              <w:pStyle w:val="Compact"/>
+            </w:pPr>
+            <w:r>
+              <w:t xml:space="preserve">Visualizacion</w:t>
+            </w:r>
+          </w:p>
+        </w:tc>
+        <w:tc>
+          <w:tcPr/>
+          <w:p>
+            <w:pPr>
+              <w:pStyle w:val="Compact"/>
+              <w:jc w:val="right"/>
+            </w:pPr>
+            <w:r>
+              <w:t xml:space="preserve">3</w:t>
+            </w:r>
+          </w:p>
+        </w:tc>
+        <w:tc>
+          <w:tcPr/>
+          <w:p>
+            <w:pPr>
+              <w:pStyle w:val="Compact"/>
+            </w:pPr>
+            <w:r>
+              <w:t xml:space="preserve">Graficos ggplot y heatmaps plotly.</w:t>
+            </w:r>
+          </w:p>
+        </w:tc>
+      </w:tr>
+      <w:tr>
+        <w:tc>
+          <w:tcPr/>
+          <w:p>
+            <w:pPr>
+              <w:pStyle w:val="Compact"/>
+            </w:pPr>
+            <w:r>
+              <w:t xml:space="preserve">Reportes</w:t>
+            </w:r>
+          </w:p>
+        </w:tc>
+        <w:tc>
+          <w:tcPr/>
+          <w:p>
+            <w:pPr>
+              <w:pStyle w:val="Compact"/>
+              <w:jc w:val="right"/>
+            </w:pPr>
+            <w:r>
+              <w:t xml:space="preserve">18</w:t>
+            </w:r>
+          </w:p>
+        </w:tc>
+        <w:tc>
+          <w:tcPr/>
+          <w:p>
+            <w:pPr>
+              <w:pStyle w:val="Compact"/>
+            </w:pPr>
+            <w:r>
+              <w:t xml:space="preserve">Helpers para tablas, resumenes, valor asignado y reportes Rmd.</w:t>
+            </w:r>
+          </w:p>
+        </w:tc>
+      </w:tr>
+      <w:tr>
+        <w:tc>
+          <w:tcPr/>
+          <w:p>
+            <w:pPr>
+              <w:pStyle w:val="Compact"/>
+            </w:pPr>
+            <w:r>
+              <w:t xml:space="preserve">Servidor Shiny</w:t>
+            </w:r>
+          </w:p>
+        </w:tc>
+        <w:tc>
+          <w:tcPr/>
+          <w:p>
+            <w:pPr>
+              <w:pStyle w:val="Compact"/>
+              <w:jc w:val="right"/>
+            </w:pPr>
+            <w:r>
+              <w:t xml:space="preserve">3</w:t>
+            </w:r>
+          </w:p>
+        </w:tc>
+        <w:tc>
+          <w:tcPr/>
+          <w:p>
+            <w:pPr>
+              <w:pStyle w:val="Compact"/>
+            </w:pPr>
+            <w:r>
+              <w:t xml:space="preserve">Funcion servidor, ejecucion de scripts y preprocesador.</w:t>
+            </w:r>
+          </w:p>
+        </w:tc>
+      </w:tr>
+      <w:tr>
+        <w:tc>
+          <w:tcPr/>
+          <w:p>
+            <w:pPr>
+              <w:pStyle w:val="Compact"/>
+            </w:pPr>
+            <w:r>
+              <w:t xml:space="preserve">UI / Utilidades</w:t>
+            </w:r>
+          </w:p>
+        </w:tc>
+        <w:tc>
+          <w:tcPr/>
+          <w:p>
+            <w:pPr>
+              <w:pStyle w:val="Compact"/>
+              <w:jc w:val="right"/>
+            </w:pPr>
+            <w:r>
+              <w:t xml:space="preserve">3</w:t>
+            </w:r>
+          </w:p>
+        </w:tc>
+        <w:tc>
+          <w:tcPr/>
+          <w:p>
+            <w:pPr>
+              <w:pStyle w:val="Compact"/>
+            </w:pPr>
+            <w:r>
+              <w:t xml:space="preserve">Ecuaciones MathJax, claves y limpieza de nombres de archivo.</w:t>
+            </w:r>
+          </w:p>
+        </w:tc>
+      </w:tr>
+      <w:tr>
+        <w:tc>
+          <w:tcPr/>
+          <w:p>
+            <w:pPr>
+              <w:pStyle w:val="Compact"/>
+            </w:pPr>
+            <w:r>
+              <w:t xml:space="preserve">Obsoleto</w:t>
+            </w:r>
+          </w:p>
+        </w:tc>
+        <w:tc>
+          <w:tcPr/>
+          <w:p>
+            <w:pPr>
+              <w:pStyle w:val="Compact"/>
+              <w:jc w:val="right"/>
+            </w:pPr>
+            <w:r>
+              <w:t xml:space="preserve">3</w:t>
+            </w:r>
+          </w:p>
+        </w:tc>
+        <w:tc>
+          <w:tcPr/>
+          <w:p>
+            <w:pPr>
+              <w:pStyle w:val="Compact"/>
+            </w:pPr>
+            <w:r>
+              <w:t xml:space="preserve">Wrappers antiguos en</w:t>
+            </w:r>
+            <w:r>
+              <w:t xml:space="preserve"> </w:t>
+            </w:r>
+            <w:r>
+              <w:rPr>
+                <w:rStyle w:val="VerbatimChar"/>
+              </w:rPr>
+              <w:t xml:space="preserve">R/utils.R</w:t>
+            </w:r>
+            <w:r>
+              <w:t xml:space="preserve"> </w:t>
+            </w:r>
+            <w:r>
+              <w:t xml:space="preserve">(usar</w:t>
+            </w:r>
+            <w:r>
+              <w:t xml:space="preserve"> </w:t>
+            </w:r>
+            <w:r>
+              <w:rPr>
+                <w:rStyle w:val="VerbatimChar"/>
+              </w:rPr>
+              <w:t xml:space="preserve">ptcalc</w:t>
+            </w:r>
+            <w:r>
+              <w:t xml:space="preserve">).</w:t>
+            </w:r>
+          </w:p>
+        </w:tc>
+      </w:tr>
+    </w:tbl>
+    <w:bookmarkEnd w:id="12"/>
+    <w:bookmarkStart w:id="16" w:name="funciones-principales-por-categoria"/>
+    <w:p>
+      <w:pPr>
+        <w:pStyle w:val="Heading3"/>
+      </w:pPr>
+      <w:r>
+        <w:t xml:space="preserve">Funciones principales por categoria</w:t>
+      </w:r>
+    </w:p>
+    <w:bookmarkStart w:id="13" w:name="estadisticos-robustos"/>
     <w:p>
       <w:pPr>
         <w:pStyle w:val="Heading4"/>
       </w:pPr>
       <w:r>
-        <w:t xml:space="preserve">Estadísticas de Homogeneidad</w:t>
-      </w:r>
-    </w:p>
-    <w:p>
-      <w:pPr>
-        <w:pStyle w:val="Compact"/>
-        <w:numPr>
-          <w:ilvl w:val="0"/>
-          <w:numId w:val="1001"/>
+        <w:t xml:space="preserve">Estadisticos Robustos</w:t>
+      </w:r>
+    </w:p>
+    <w:p>
+      <w:pPr>
+        <w:pStyle w:val="Compact"/>
+        <w:numPr>
+          <w:ilvl w:val="0"/>
+          <w:numId w:val="1002"/>
+        </w:numPr>
+      </w:pPr>
+      <w:r>
+        <w:rPr>
+          <w:rStyle w:val="VerbatimChar"/>
+        </w:rPr>
+        <w:t xml:space="preserve">calculate_niqr()</w:t>
+      </w:r>
+      <w:r>
+        <w:t xml:space="preserve"> </w:t>
+      </w:r>
+      <w:r>
+        <w:t xml:space="preserve">- Rango intercuartil normalizado (ISO 13528:2022 §9.4)</w:t>
+      </w:r>
+    </w:p>
+    <w:p>
+      <w:pPr>
+        <w:pStyle w:val="Compact"/>
+        <w:numPr>
+          <w:ilvl w:val="0"/>
+          <w:numId w:val="1002"/>
+        </w:numPr>
+      </w:pPr>
+      <w:r>
+        <w:rPr>
+          <w:rStyle w:val="VerbatimChar"/>
+        </w:rPr>
+        <w:t xml:space="preserve">calculate_mad_e()</w:t>
+      </w:r>
+      <w:r>
+        <w:t xml:space="preserve"> </w:t>
+      </w:r>
+      <w:r>
+        <w:t xml:space="preserve">- MAD escalado (ISO 13528:2022 §9.4)</w:t>
+      </w:r>
+    </w:p>
+    <w:p>
+      <w:pPr>
+        <w:pStyle w:val="Compact"/>
+        <w:numPr>
+          <w:ilvl w:val="0"/>
+          <w:numId w:val="1002"/>
+        </w:numPr>
+      </w:pPr>
+      <w:r>
+        <w:rPr>
+          <w:rStyle w:val="VerbatimChar"/>
+        </w:rPr>
+        <w:t xml:space="preserve">run_algorithm_a()</w:t>
+      </w:r>
+      <w:r>
+        <w:t xml:space="preserve"> </w:t>
+      </w:r>
+      <w:r>
+        <w:t xml:space="preserve">- Algoritmo A iterativo (ISO 13528:2022 Anexo C)</w:t>
+      </w:r>
+    </w:p>
+    <w:p>
+      <w:pPr>
+        <w:pStyle w:val="Compact"/>
+        <w:numPr>
+          <w:ilvl w:val="0"/>
+          <w:numId w:val="1002"/>
+        </w:numPr>
+      </w:pPr>
+      <w:r>
+        <w:rPr>
+          <w:rStyle w:val="VerbatimChar"/>
+        </w:rPr>
+        <w:t xml:space="preserve">get_algo_a_stabilization_iter()</w:t>
+      </w:r>
+      <w:r>
+        <w:t xml:space="preserve"> </w:t>
+      </w:r>
+      <w:r>
+        <w:t xml:space="preserve">- Iteracion de convergencia</w:t>
+      </w:r>
+    </w:p>
+    <w:p>
+      <w:pPr>
+        <w:pStyle w:val="Compact"/>
+        <w:numPr>
+          <w:ilvl w:val="0"/>
+          <w:numId w:val="1002"/>
+        </w:numPr>
+      </w:pPr>
+      <w:r>
+        <w:rPr>
+          <w:rStyle w:val="VerbatimChar"/>
+        </w:rPr>
+        <w:t xml:space="preserve">run_algorithm_a_report()</w:t>
+      </w:r>
+      <w:r>
+        <w:t xml:space="preserve"> </w:t>
+      </w:r>
+      <w:r>
+        <w:t xml:space="preserve">- Wrapper para informes</w:t>
+      </w:r>
+    </w:p>
+    <w:p>
+      <w:pPr>
+        <w:pStyle w:val="Compact"/>
+        <w:numPr>
+          <w:ilvl w:val="0"/>
+          <w:numId w:val="1002"/>
+        </w:numPr>
+      </w:pPr>
+      <w:r>
+        <w:rPr>
+          <w:rStyle w:val="VerbatimChar"/>
+        </w:rPr>
+        <w:t xml:space="preserve">stable_sigfig_value()</w:t>
+      </w:r>
+      <w:r>
+        <w:t xml:space="preserve"> </w:t>
+      </w:r>
+      <w:r>
+        <w:t xml:space="preserve">- Redondeo a cifras significativas</w:t>
+      </w:r>
+    </w:p>
+    <w:bookmarkEnd w:id="13"/>
+    <w:bookmarkStart w:id="14" w:name="homogeneidad-y-estabilidad"/>
+    <w:p>
+      <w:pPr>
+        <w:pStyle w:val="Heading4"/>
+      </w:pPr>
+      <w:r>
+        <w:t xml:space="preserve">Homogeneidad y Estabilidad</w:t>
+      </w:r>
+    </w:p>
+    <w:p>
+      <w:pPr>
+        <w:pStyle w:val="Compact"/>
+        <w:numPr>
+          <w:ilvl w:val="0"/>
+          <w:numId w:val="1003"/>
         </w:numPr>
       </w:pPr>
       <w:r>
@@ -521,15 +1420,15 @@
         <w:t xml:space="preserve"> </w:t>
       </w:r>
       <w:r>
-        <w:t xml:space="preserve">- Estadísticos ANOVA</w:t>
-      </w:r>
-    </w:p>
-    <w:p>
-      <w:pPr>
-        <w:pStyle w:val="Compact"/>
-        <w:numPr>
-          <w:ilvl w:val="0"/>
-          <w:numId w:val="1001"/>
+        <w:t xml:space="preserve">- Estadisticos de homogeneidad (ISO 13528:2022 §9.2)</w:t>
+      </w:r>
+    </w:p>
+    <w:p>
+      <w:pPr>
+        <w:pStyle w:val="Compact"/>
+        <w:numPr>
+          <w:ilvl w:val="0"/>
+          <w:numId w:val="1003"/>
         </w:numPr>
       </w:pPr>
       <w:r>
@@ -542,15 +1441,15 @@
         <w:t xml:space="preserve"> </w:t>
       </w:r>
       <w:r>
-        <w:t xml:space="preserve">- Criterio de homogeneidad</w:t>
-      </w:r>
-    </w:p>
-    <w:p>
-      <w:pPr>
-        <w:pStyle w:val="Compact"/>
-        <w:numPr>
-          <w:ilvl w:val="0"/>
-          <w:numId w:val="1001"/>
+        <w:t xml:space="preserve">- Criterio c = 0.3 sigma_pt</w:t>
+      </w:r>
+    </w:p>
+    <w:p>
+      <w:pPr>
+        <w:pStyle w:val="Compact"/>
+        <w:numPr>
+          <w:ilvl w:val="0"/>
+          <w:numId w:val="1003"/>
         </w:numPr>
       </w:pPr>
       <w:r>
@@ -571,7 +1470,7 @@
         <w:pStyle w:val="Compact"/>
         <w:numPr>
           <w:ilvl w:val="0"/>
-          <w:numId w:val="1001"/>
+          <w:numId w:val="1003"/>
         </w:numPr>
       </w:pPr>
       <w:r>
@@ -584,184 +1483,185 @@
         <w:t xml:space="preserve"> </w:t>
       </w:r>
       <w:r>
-        <w:t xml:space="preserve">- Evaluación de criterios</w:t>
-      </w:r>
-    </w:p>
-    <w:bookmarkEnd w:id="12"/>
-    <w:bookmarkStart w:id="13" w:name="estadísticas-de-estabilidad"/>
+        <w:t xml:space="preserve">- Evaluacion de criterios</w:t>
+      </w:r>
+    </w:p>
+    <w:p>
+      <w:pPr>
+        <w:pStyle w:val="Compact"/>
+        <w:numPr>
+          <w:ilvl w:val="0"/>
+          <w:numId w:val="1003"/>
+        </w:numPr>
+      </w:pPr>
+      <w:r>
+        <w:rPr>
+          <w:rStyle w:val="VerbatimChar"/>
+        </w:rPr>
+        <w:t xml:space="preserve">calculate_stability_stats()</w:t>
+      </w:r>
+      <w:r>
+        <w:t xml:space="preserve"> </w:t>
+      </w:r>
+      <w:r>
+        <w:t xml:space="preserve">- Estadisticos de estabilidad</w:t>
+      </w:r>
+    </w:p>
+    <w:p>
+      <w:pPr>
+        <w:pStyle w:val="Compact"/>
+        <w:numPr>
+          <w:ilvl w:val="0"/>
+          <w:numId w:val="1003"/>
+        </w:numPr>
+      </w:pPr>
+      <w:r>
+        <w:rPr>
+          <w:rStyle w:val="VerbatimChar"/>
+        </w:rPr>
+        <w:t xml:space="preserve">calculate_stability_criterion()</w:t>
+      </w:r>
+      <w:r>
+        <w:t xml:space="preserve"> </w:t>
+      </w:r>
+      <w:r>
+        <w:t xml:space="preserve">- Criterio de estabilidad</w:t>
+      </w:r>
+    </w:p>
+    <w:p>
+      <w:pPr>
+        <w:pStyle w:val="Compact"/>
+        <w:numPr>
+          <w:ilvl w:val="0"/>
+          <w:numId w:val="1003"/>
+        </w:numPr>
+      </w:pPr>
+      <w:r>
+        <w:rPr>
+          <w:rStyle w:val="VerbatimChar"/>
+        </w:rPr>
+        <w:t xml:space="preserve">evaluate_stability()</w:t>
+      </w:r>
+      <w:r>
+        <w:t xml:space="preserve"> </w:t>
+      </w:r>
+      <w:r>
+        <w:t xml:space="preserve">- Evaluacion de estabilidad</w:t>
+      </w:r>
+    </w:p>
+    <w:p>
+      <w:pPr>
+        <w:pStyle w:val="Compact"/>
+        <w:numPr>
+          <w:ilvl w:val="0"/>
+          <w:numId w:val="1003"/>
+        </w:numPr>
+      </w:pPr>
+      <w:r>
+        <w:rPr>
+          <w:rStyle w:val="VerbatimChar"/>
+        </w:rPr>
+        <w:t xml:space="preserve">calculate_u_hom()</w:t>
+      </w:r>
+      <w:r>
+        <w:t xml:space="preserve"> </w:t>
+      </w:r>
+      <w:r>
+        <w:t xml:space="preserve">- Incertidumbre de homogeneidad</w:t>
+      </w:r>
+    </w:p>
+    <w:p>
+      <w:pPr>
+        <w:pStyle w:val="Compact"/>
+        <w:numPr>
+          <w:ilvl w:val="0"/>
+          <w:numId w:val="1003"/>
+        </w:numPr>
+      </w:pPr>
+      <w:r>
+        <w:rPr>
+          <w:rStyle w:val="VerbatimChar"/>
+        </w:rPr>
+        <w:t xml:space="preserve">calculate_u_stab()</w:t>
+      </w:r>
+      <w:r>
+        <w:t xml:space="preserve"> </w:t>
+      </w:r>
+      <w:r>
+        <w:t xml:space="preserve">- Incertidumbre de estabilidad</w:t>
+      </w:r>
+    </w:p>
+    <w:p>
+      <w:pPr>
+        <w:pStyle w:val="Compact"/>
+        <w:numPr>
+          <w:ilvl w:val="0"/>
+          <w:numId w:val="1003"/>
+        </w:numPr>
+      </w:pPr>
+      <w:r>
+        <w:rPr>
+          <w:rStyle w:val="VerbatimChar"/>
+        </w:rPr>
+        <w:t xml:space="preserve">compute_homogeneity_metrics()</w:t>
+      </w:r>
+      <w:r>
+        <w:t xml:space="preserve"> </w:t>
+      </w:r>
+      <w:r>
+        <w:t xml:space="preserve">- Wrapper completo de app.R</w:t>
+      </w:r>
+    </w:p>
+    <w:p>
+      <w:pPr>
+        <w:pStyle w:val="Compact"/>
+        <w:numPr>
+          <w:ilvl w:val="0"/>
+          <w:numId w:val="1003"/>
+        </w:numPr>
+      </w:pPr>
+      <w:r>
+        <w:rPr>
+          <w:rStyle w:val="VerbatimChar"/>
+        </w:rPr>
+        <w:t xml:space="preserve">compute_stability_metrics()</w:t>
+      </w:r>
+      <w:r>
+        <w:t xml:space="preserve"> </w:t>
+      </w:r>
+      <w:r>
+        <w:t xml:space="preserve">- Wrapper completo de app.R</w:t>
+      </w:r>
+    </w:p>
+    <w:p>
+      <w:pPr>
+        <w:pStyle w:val="Compact"/>
+        <w:numPr>
+          <w:ilvl w:val="0"/>
+          <w:numId w:val="1003"/>
+        </w:numPr>
+      </w:pPr>
+      <w:r>
+        <w:rPr>
+          <w:rStyle w:val="VerbatimChar"/>
+        </w:rPr>
+        <w:t xml:space="preserve">compute_homogeneity()</w:t>
+      </w:r>
+      <w:r>
+        <w:t xml:space="preserve"> </w:t>
+      </w:r>
+      <w:r>
+        <w:t xml:space="preserve">- Wrapper del reporte Rmd</w:t>
+      </w:r>
+    </w:p>
+    <w:bookmarkEnd w:id="14"/>
+    <w:bookmarkStart w:id="15" w:name="puntajes-pt"/>
     <w:p>
       <w:pPr>
         <w:pStyle w:val="Heading4"/>
       </w:pPr>
       <w:r>
-        <w:t xml:space="preserve">Estadísticas de Estabilidad</w:t>
-      </w:r>
-    </w:p>
-    <w:p>
-      <w:pPr>
-        <w:pStyle w:val="Compact"/>
-        <w:numPr>
-          <w:ilvl w:val="0"/>
-          <w:numId w:val="1002"/>
-        </w:numPr>
-      </w:pPr>
-      <w:r>
-        <w:rPr>
-          <w:rStyle w:val="VerbatimChar"/>
-        </w:rPr>
-        <w:t xml:space="preserve">calculate_stability_stats()</w:t>
-      </w:r>
-      <w:r>
-        <w:t xml:space="preserve"> </w:t>
-      </w:r>
-      <w:r>
-        <w:t xml:space="preserve">- Estadísticos de estabilidad</w:t>
-      </w:r>
-    </w:p>
-    <w:p>
-      <w:pPr>
-        <w:pStyle w:val="Compact"/>
-        <w:numPr>
-          <w:ilvl w:val="0"/>
-          <w:numId w:val="1002"/>
-        </w:numPr>
-      </w:pPr>
-      <w:r>
-        <w:rPr>
-          <w:rStyle w:val="VerbatimChar"/>
-        </w:rPr>
-        <w:t xml:space="preserve">calculate_stability_criterion()</w:t>
-      </w:r>
-      <w:r>
-        <w:t xml:space="preserve"> </w:t>
-      </w:r>
-      <w:r>
-        <w:t xml:space="preserve">- Criterio de estabilidad</w:t>
-      </w:r>
-    </w:p>
-    <w:p>
-      <w:pPr>
-        <w:pStyle w:val="Compact"/>
-        <w:numPr>
-          <w:ilvl w:val="0"/>
-          <w:numId w:val="1002"/>
-        </w:numPr>
-      </w:pPr>
-      <w:r>
-        <w:rPr>
-          <w:rStyle w:val="VerbatimChar"/>
-        </w:rPr>
-        <w:t xml:space="preserve">evaluate_stability()</w:t>
-      </w:r>
-      <w:r>
-        <w:t xml:space="preserve"> </w:t>
-      </w:r>
-      <w:r>
-        <w:t xml:space="preserve">- Evaluación de estabilidad</w:t>
-      </w:r>
-    </w:p>
-    <w:bookmarkEnd w:id="13"/>
-    <w:bookmarkStart w:id="14" w:name="estadísticas-robustos"/>
-    <w:p>
-      <w:pPr>
-        <w:pStyle w:val="Heading4"/>
-      </w:pPr>
-      <w:r>
-        <w:t xml:space="preserve">Estadísticas Robustos</w:t>
-      </w:r>
-    </w:p>
-    <w:p>
-      <w:pPr>
-        <w:pStyle w:val="Compact"/>
-        <w:numPr>
-          <w:ilvl w:val="0"/>
-          <w:numId w:val="1003"/>
-        </w:numPr>
-      </w:pPr>
-      <w:r>
-        <w:rPr>
-          <w:rStyle w:val="VerbatimChar"/>
-        </w:rPr>
-        <w:t xml:space="preserve">calculate_niqr()</w:t>
-      </w:r>
-      <w:r>
-        <w:t xml:space="preserve"> </w:t>
-      </w:r>
-      <w:r>
-        <w:t xml:space="preserve">- nIQR (ISO 13528:2022 §9.4)</w:t>
-      </w:r>
-    </w:p>
-    <w:p>
-      <w:pPr>
-        <w:pStyle w:val="Compact"/>
-        <w:numPr>
-          <w:ilvl w:val="0"/>
-          <w:numId w:val="1003"/>
-        </w:numPr>
-      </w:pPr>
-      <w:r>
-        <w:rPr>
-          <w:rStyle w:val="VerbatimChar"/>
-        </w:rPr>
-        <w:t xml:space="preserve">calculate_mad_e()</w:t>
-      </w:r>
-      <w:r>
-        <w:t xml:space="preserve"> </w:t>
-      </w:r>
-      <w:r>
-        <w:t xml:space="preserve">- MADe (ISO 13528:2022 §9.4)</w:t>
-      </w:r>
-    </w:p>
-    <w:p>
-      <w:pPr>
-        <w:pStyle w:val="Compact"/>
-        <w:numPr>
-          <w:ilvl w:val="0"/>
-          <w:numId w:val="1003"/>
-        </w:numPr>
-      </w:pPr>
-      <w:r>
-        <w:rPr>
-          <w:rStyle w:val="VerbatimChar"/>
-        </w:rPr>
-        <w:t xml:space="preserve">run_algorithm_a()</w:t>
-      </w:r>
-      <w:r>
-        <w:t xml:space="preserve"> </w:t>
-      </w:r>
-      <w:r>
-        <w:t xml:space="preserve">- Algoritmo A iterativo</w:t>
-      </w:r>
-    </w:p>
-    <w:p>
-      <w:pPr>
-        <w:pStyle w:val="Compact"/>
-        <w:numPr>
-          <w:ilvl w:val="0"/>
-          <w:numId w:val="1003"/>
-        </w:numPr>
-      </w:pPr>
-      <w:r>
-        <w:rPr>
-          <w:rStyle w:val="VerbatimChar"/>
-        </w:rPr>
-        <w:t xml:space="preserve">algorithm_A()</w:t>
-      </w:r>
-      <w:r>
-        <w:t xml:space="preserve"> </w:t>
-      </w:r>
-      <w:r>
-        <w:t xml:space="preserve">- Versión exportada del Algoritmo A</w:t>
-      </w:r>
-    </w:p>
-    <w:bookmarkEnd w:id="14"/>
-    <w:bookmarkStart w:id="15" w:name="cálculo-de-puntajes-pt"/>
-    <w:p>
-      <w:pPr>
-        <w:pStyle w:val="Heading4"/>
-      </w:pPr>
-      <w:r>
-        <w:t xml:space="preserve">Cálculo de Puntajes PT</w:t>
+        <w:t xml:space="preserve">Puntajes PT</w:t>
       </w:r>
     </w:p>
     <w:p>
@@ -824,7 +1724,7 @@
         <w:t xml:space="preserve"> </w:t>
       </w:r>
       <w:r>
-        <w:t xml:space="preserve">- Puntaje ζ (ISO 13528:2022 §10.4)</w:t>
+        <w:t xml:space="preserve">- Puntaje zeta (ISO 13528:2022 §10.4)</w:t>
       </w:r>
     </w:p>
     <w:p>
@@ -866,7 +1766,22 @@
         <w:t xml:space="preserve"> </w:t>
       </w:r>
       <w:r>
-        <w:t xml:space="preserve">- Clasificación de puntajes z</w:t>
+        <w:t xml:space="preserve">/</w:t>
+      </w:r>
+      <w:r>
+        <w:t xml:space="preserve"> </w:t>
+      </w:r>
+      <w:r>
+        <w:rPr>
+          <w:rStyle w:val="VerbatimChar"/>
+        </w:rPr>
+        <w:t xml:space="preserve">evaluate_z_score_vec()</w:t>
+      </w:r>
+      <w:r>
+        <w:t xml:space="preserve"> </w:t>
+      </w:r>
+      <w:r>
+        <w:t xml:space="preserve">- Clasificacion z</w:t>
       </w:r>
     </w:p>
     <w:p>
@@ -887,146 +1802,154 @@
         <w:t xml:space="preserve"> </w:t>
       </w:r>
       <w:r>
-        <w:t xml:space="preserve">- Clasificación de puntajes En</w:t>
+        <w:t xml:space="preserve">/</w:t>
+      </w:r>
+      <w:r>
+        <w:t xml:space="preserve"> </w:t>
+      </w:r>
+      <w:r>
+        <w:rPr>
+          <w:rStyle w:val="VerbatimChar"/>
+        </w:rPr>
+        <w:t xml:space="preserve">evaluate_en_score_vec()</w:t>
+      </w:r>
+      <w:r>
+        <w:t xml:space="preserve"> </w:t>
+      </w:r>
+      <w:r>
+        <w:t xml:space="preserve">- Clasificacion En</w:t>
+      </w:r>
+    </w:p>
+    <w:p>
+      <w:pPr>
+        <w:pStyle w:val="Compact"/>
+        <w:numPr>
+          <w:ilvl w:val="0"/>
+          <w:numId w:val="1004"/>
+        </w:numPr>
+      </w:pPr>
+      <w:r>
+        <w:rPr>
+          <w:rStyle w:val="VerbatimChar"/>
+        </w:rPr>
+        <w:t xml:space="preserve">compute_combo_scores()</w:t>
+      </w:r>
+      <w:r>
+        <w:t xml:space="preserve"> </w:t>
+      </w:r>
+      <w:r>
+        <w:t xml:space="preserve">- Calculo nuclear de puntajes en app.R</w:t>
+      </w:r>
+    </w:p>
+    <w:p>
+      <w:pPr>
+        <w:pStyle w:val="Compact"/>
+        <w:numPr>
+          <w:ilvl w:val="0"/>
+          <w:numId w:val="1004"/>
+        </w:numPr>
+      </w:pPr>
+      <w:r>
+        <w:rPr>
+          <w:rStyle w:val="VerbatimChar"/>
+        </w:rPr>
+        <w:t xml:space="preserve">compute_scores_for_selection()</w:t>
+      </w:r>
+      <w:r>
+        <w:t xml:space="preserve"> </w:t>
+      </w:r>
+      <w:r>
+        <w:t xml:space="preserve">- Orquestador del modulo de puntajes</w:t>
+      </w:r>
+    </w:p>
+    <w:p>
+      <w:pPr>
+        <w:pStyle w:val="Compact"/>
+        <w:numPr>
+          <w:ilvl w:val="0"/>
+          <w:numId w:val="1004"/>
+        </w:numPr>
+      </w:pPr>
+      <w:r>
+        <w:rPr>
+          <w:rStyle w:val="VerbatimChar"/>
+        </w:rPr>
+        <w:t xml:space="preserve">compute_scores_metrics()</w:t>
+      </w:r>
+      <w:r>
+        <w:t xml:space="preserve"> </w:t>
+      </w:r>
+      <w:r>
+        <w:t xml:space="preserve">- Calculo vectorizado para reportes</w:t>
+      </w:r>
+    </w:p>
+    <w:p>
+      <w:pPr>
+        <w:pStyle w:val="Compact"/>
+        <w:numPr>
+          <w:ilvl w:val="0"/>
+          <w:numId w:val="1004"/>
+        </w:numPr>
+      </w:pPr>
+      <w:r>
+        <w:rPr>
+          <w:rStyle w:val="VerbatimChar"/>
+        </w:rPr>
+        <w:t xml:space="preserve">calculate_expert_sigma_pt()</w:t>
+      </w:r>
+      <w:r>
+        <w:t xml:space="preserve"> </w:t>
+      </w:r>
+      <w:r>
+        <w:t xml:space="preserve">/</w:t>
+      </w:r>
+      <w:r>
+        <w:t xml:space="preserve"> </w:t>
+      </w:r>
+      <w:r>
+        <w:rPr>
+          <w:rStyle w:val="VerbatimChar"/>
+        </w:rPr>
+        <w:t xml:space="preserve">calculate_expert_u_xpt()</w:t>
+      </w:r>
+      <w:r>
+        <w:t xml:space="preserve"> </w:t>
+      </w:r>
+      <w:r>
+        <w:t xml:space="preserve">- Metodo experto</w:t>
+      </w:r>
+    </w:p>
+    <w:p>
+      <w:pPr>
+        <w:pStyle w:val="Compact"/>
+        <w:numPr>
+          <w:ilvl w:val="0"/>
+          <w:numId w:val="1004"/>
+        </w:numPr>
+      </w:pPr>
+      <w:r>
+        <w:rPr>
+          <w:rStyle w:val="VerbatimChar"/>
+        </w:rPr>
+        <w:t xml:space="preserve">evaluate_u_xpt_sigma_criterion()</w:t>
+      </w:r>
+      <w:r>
+        <w:t xml:space="preserve"> </w:t>
+      </w:r>
+      <w:r>
+        <w:t xml:space="preserve">- Criterio u(x_pt) &lt;= 0.3 sigma_pt</w:t>
       </w:r>
     </w:p>
     <w:bookmarkEnd w:id="15"/>
-    <w:bookmarkStart w:id="16" w:name="utilidades"/>
-    <w:p>
-      <w:pPr>
-        <w:pStyle w:val="Heading4"/>
-      </w:pPr>
-      <w:r>
-        <w:t xml:space="preserve">Utilidades</w:t>
-      </w:r>
-    </w:p>
-    <w:p>
-      <w:pPr>
-        <w:pStyle w:val="Compact"/>
-        <w:numPr>
-          <w:ilvl w:val="0"/>
-          <w:numId w:val="1005"/>
-        </w:numPr>
-      </w:pPr>
-      <w:r>
-        <w:rPr>
-          <w:rStyle w:val="VerbatimChar"/>
-        </w:rPr>
-        <w:t xml:space="preserve">calculate_u_hom()</w:t>
-      </w:r>
-      <w:r>
-        <w:t xml:space="preserve"> </w:t>
-      </w:r>
-      <w:r>
-        <w:t xml:space="preserve">- Incertidumbre de homogeneidad</w:t>
-      </w:r>
-    </w:p>
-    <w:p>
-      <w:pPr>
-        <w:pStyle w:val="Compact"/>
-        <w:numPr>
-          <w:ilvl w:val="0"/>
-          <w:numId w:val="1005"/>
-        </w:numPr>
-      </w:pPr>
-      <w:r>
-        <w:rPr>
-          <w:rStyle w:val="VerbatimChar"/>
-        </w:rPr>
-        <w:t xml:space="preserve">calculate_u_stab()</w:t>
-      </w:r>
-      <w:r>
-        <w:t xml:space="preserve"> </w:t>
-      </w:r>
-      <w:r>
-        <w:t xml:space="preserve">- Incertidumbre de estabilidad</w:t>
-      </w:r>
-    </w:p>
-    <w:p>
-      <w:pPr>
-        <w:pStyle w:val="Compact"/>
-        <w:numPr>
-          <w:ilvl w:val="0"/>
-          <w:numId w:val="1005"/>
-        </w:numPr>
-      </w:pPr>
-      <w:r>
-        <w:rPr>
-          <w:rStyle w:val="VerbatimChar"/>
-        </w:rPr>
-        <w:t xml:space="preserve">format_with_n()</w:t>
-      </w:r>
-      <w:r>
-        <w:t xml:space="preserve"> </w:t>
-      </w:r>
-      <w:r>
-        <w:t xml:space="preserve">- Formateo con n</w:t>
-      </w:r>
-    </w:p>
-    <w:p>
-      <w:pPr>
-        <w:pStyle w:val="Compact"/>
-        <w:numPr>
-          <w:ilvl w:val="0"/>
-          <w:numId w:val="1005"/>
-        </w:numPr>
-      </w:pPr>
-      <w:r>
-        <w:rPr>
-          <w:rStyle w:val="VerbatimChar"/>
-        </w:rPr>
-        <w:t xml:space="preserve">get_participants_for_combo()</w:t>
-      </w:r>
-      <w:r>
-        <w:t xml:space="preserve"> </w:t>
-      </w:r>
-      <w:r>
-        <w:t xml:space="preserve">- Obtener participantes</w:t>
-      </w:r>
-    </w:p>
-    <w:p>
-      <w:pPr>
-        <w:pStyle w:val="Compact"/>
-        <w:numPr>
-          <w:ilvl w:val="0"/>
-          <w:numId w:val="1005"/>
-        </w:numPr>
-      </w:pPr>
-      <w:r>
-        <w:rPr>
-          <w:rStyle w:val="VerbatimChar"/>
-        </w:rPr>
-        <w:t xml:space="preserve">get_sample_data()</w:t>
-      </w:r>
-      <w:r>
-        <w:t xml:space="preserve"> </w:t>
-      </w:r>
-      <w:r>
-        <w:t xml:space="preserve">- Obtener datos de muestra</w:t>
-      </w:r>
-    </w:p>
-    <w:p>
-      <w:pPr>
-        <w:pStyle w:val="Compact"/>
-        <w:numPr>
-          <w:ilvl w:val="0"/>
-          <w:numId w:val="1005"/>
-        </w:numPr>
-      </w:pPr>
-      <w:r>
-        <w:t xml:space="preserve">Otras 23 funciones auxiliares</w:t>
-      </w:r>
-    </w:p>
     <w:bookmarkEnd w:id="16"/>
     <w:bookmarkEnd w:id="17"/>
-    <w:bookmarkEnd w:id="18"/>
-    <w:bookmarkStart w:id="19" w:name="uso-del-script-de-extracción"/>
+    <w:bookmarkStart w:id="19" w:name="uso-del-script-de-extraccion"/>
     <w:p>
       <w:pPr>
         <w:pStyle w:val="Heading2"/>
       </w:pPr>
       <w:r>
-        <w:t xml:space="preserve">Uso del Script de Extracción</w:t>
+        <w:t xml:space="preserve">Uso del Script de Extraccion</w:t>
       </w:r>
     </w:p>
     <w:p>
@@ -1034,7 +1957,7 @@
         <w:pStyle w:val="FirstParagraph"/>
       </w:pPr>
       <w:r>
-        <w:t xml:space="preserve">Para ejecutar el script de extracción:</w:t>
+        <w:t xml:space="preserve">Para regenerar la documentacion desde la raiz del proyecto:</w:t>
       </w:r>
     </w:p>
     <w:p>
@@ -1043,18 +1966,70 @@
       </w:pPr>
       <w:r>
         <w:rPr>
-          <w:rStyle w:val="CommentTok"/>
-        </w:rPr>
-        <w:t xml:space="preserve"># Ir al directorio del script</w:t>
-      </w:r>
-      <w:r>
-        <w:br/>
-      </w:r>
+          <w:rStyle w:val="NormalTok"/>
+        </w:rPr>
+        <w:t xml:space="preserve">Rscript Entregables_pt_app</w:t>
+      </w:r>
+      <w:r>
+        <w:rPr>
+          <w:rStyle w:val="SpecialCharTok"/>
+        </w:rPr>
+        <w:t xml:space="preserve">/</w:t>
+      </w:r>
+      <w:r>
+        <w:rPr>
+          <w:rStyle w:val="DecValTok"/>
+        </w:rPr>
+        <w:t xml:space="preserve">02</w:t>
+      </w:r>
+      <w:r>
+        <w:rPr>
+          <w:rStyle w:val="NormalTok"/>
+        </w:rPr>
+        <w:t xml:space="preserve">_funciones_usadas</w:t>
+      </w:r>
+      <w:r>
+        <w:rPr>
+          <w:rStyle w:val="SpecialCharTok"/>
+        </w:rPr>
+        <w:t xml:space="preserve">/</w:t>
+      </w:r>
+      <w:r>
+        <w:rPr>
+          <w:rStyle w:val="NormalTok"/>
+        </w:rPr>
+        <w:t xml:space="preserve">R</w:t>
+      </w:r>
+      <w:r>
+        <w:rPr>
+          <w:rStyle w:val="SpecialCharTok"/>
+        </w:rPr>
+        <w:t xml:space="preserve">/</w:t>
+      </w:r>
+      <w:r>
+        <w:rPr>
+          <w:rStyle w:val="NormalTok"/>
+        </w:rPr>
+        <w:t xml:space="preserve">lista_funciones.R</w:t>
+      </w:r>
+    </w:p>
+    <w:p>
+      <w:pPr>
+        <w:pStyle w:val="FirstParagraph"/>
+      </w:pPr>
+      <w:r>
+        <w:t xml:space="preserve">O desde R:</w:t>
+      </w:r>
+    </w:p>
+    <w:p>
+      <w:pPr>
+        <w:pStyle w:val="SourceCode"/>
+      </w:pPr>
       <w:r>
         <w:rPr>
           <w:rStyle w:val="FunctionTok"/>
         </w:rPr>
-        <w:t xml:space="preserve">setwd</w:t>
+        <w:t xml:space="preserve">source</w:t>
       </w:r>
       <w:r>
         <w:rPr>
@@ -1066,7 +2041,7 @@
         <w:rPr>
           <w:rStyle w:val="StringTok"/>
         </w:rPr>
-        <w:t xml:space="preserve">"Entregables_pt_app/02_funciones_usadas/R"</w:t>
+        <w:t xml:space="preserve">"Entregables_pt_app/02_funciones_usadas/R/lista_funciones.R"</w:t>
       </w:r>
       <w:r>
         <w:rPr>
@@ -1074,45 +2049,6 @@
         </w:rPr>
         <w:t xml:space="preserve">)</w:t>
       </w:r>
-      <w:r>
-        <w:br/>
-      </w:r>
-      <w:r>
-        <w:br/>
-      </w:r>
-      <w:r>
-        <w:rPr>
-          <w:rStyle w:val="CommentTok"/>
-        </w:rPr>
-        <w:t xml:space="preserve"># Ejecutar el script</w:t>
-      </w:r>
-      <w:r>
-        <w:br/>
-      </w:r>
-      <w:r>
-        <w:rPr>
-          <w:rStyle w:val="FunctionTok"/>
-        </w:rPr>
-        <w:t xml:space="preserve">source</w:t>
-      </w:r>
-      <w:r>
-        <w:rPr>
-          <w:rStyle w:val="NormalTok"/>
-        </w:rPr>
-        <w:t xml:space="preserve">(</w:t>
-      </w:r>
-      <w:r>
-        <w:rPr>
-          <w:rStyle w:val="StringTok"/>
-        </w:rPr>
-        <w:t xml:space="preserve">"lista_funciones.R"</w:t>
-      </w:r>
-      <w:r>
-        <w:rPr>
-          <w:rStyle w:val="NormalTok"/>
-        </w:rPr>
-        <w:t xml:space="preserve">)</w:t>
-      </w:r>
     </w:p>
     <w:p>
       <w:pPr>
@@ -1121,15 +2057,15 @@
       <w:r>
         <w:t xml:space="preserve">El script genera:</w:t>
       </w:r>
-      <w:r>
-        <w:t xml:space="preserve"> </w:t>
-      </w:r>
-      <w:r>
-        <w:t xml:space="preserve">1.</w:t>
-      </w:r>
-      <w:r>
-        <w:t xml:space="preserve"> </w:t>
-      </w:r>
+    </w:p>
+    <w:p>
+      <w:pPr>
+        <w:pStyle w:val="Compact"/>
+        <w:numPr>
+          <w:ilvl w:val="0"/>
+          <w:numId w:val="1005"/>
+        </w:numPr>
+      </w:pPr>
       <w:r>
         <w:rPr>
           <w:b/>
@@ -1144,23 +2080,23 @@
         <w:rPr>
           <w:rStyle w:val="VerbatimChar"/>
         </w:rPr>
-        <w:t xml:space="preserve">md/funciones_extraidas.csv</w:t>
-      </w:r>
-      <w:r>
-        <w:t xml:space="preserve"> </w:t>
-      </w:r>
-      <w:r>
-        <w:t xml:space="preserve">- Tabla con metadata</w:t>
-      </w:r>
-      <w:r>
-        <w:t xml:space="preserve"> </w:t>
-      </w:r>
-      <w:r>
-        <w:t xml:space="preserve">2.</w:t>
-      </w:r>
-      <w:r>
-        <w:t xml:space="preserve"> </w:t>
-      </w:r>
+        <w:t xml:space="preserve">funciones_extraidas.csv</w:t>
+      </w:r>
+      <w:r>
+        <w:t xml:space="preserve"> </w:t>
+      </w:r>
+      <w:r>
+        <w:t xml:space="preserve">- Tabla con metadata estructurada.</w:t>
+      </w:r>
+    </w:p>
+    <w:p>
+      <w:pPr>
+        <w:pStyle w:val="Compact"/>
+        <w:numPr>
+          <w:ilvl w:val="0"/>
+          <w:numId w:val="1005"/>
+        </w:numPr>
+      </w:pPr>
       <w:r>
         <w:rPr>
           <w:b/>
@@ -1181,17 +2117,170 @@
         <w:t xml:space="preserve"> </w:t>
       </w:r>
       <w:r>
-        <w:t xml:space="preserve">- Documentación legible</w:t>
-      </w:r>
-    </w:p>
+        <w:t xml:space="preserve">- Documentacion legible.</w:t>
+      </w:r>
+    </w:p>
+    <w:bookmarkStart w:id="18" w:name="fuentes-escaneadas"/>
+    <w:p>
+      <w:pPr>
+        <w:pStyle w:val="Heading3"/>
+      </w:pPr>
+      <w:r>
+        <w:t xml:space="preserve">Fuentes escaneadas</w:t>
+      </w:r>
+    </w:p>
+    <w:p>
+      <w:pPr>
+        <w:pStyle w:val="Compact"/>
+        <w:numPr>
+          <w:ilvl w:val="0"/>
+          <w:numId w:val="1006"/>
+        </w:numPr>
+      </w:pPr>
+      <w:r>
+        <w:rPr>
+          <w:rStyle w:val="VerbatimChar"/>
+        </w:rPr>
+        <w:t xml:space="preserve">app.R</w:t>
+      </w:r>
+    </w:p>
+    <w:p>
+      <w:pPr>
+        <w:pStyle w:val="Compact"/>
+        <w:numPr>
+          <w:ilvl w:val="0"/>
+          <w:numId w:val="1006"/>
+        </w:numPr>
+      </w:pPr>
+      <w:r>
+        <w:rPr>
+          <w:rStyle w:val="VerbatimChar"/>
+        </w:rPr>
+        <w:t xml:space="preserve">R/pt_homogeneity.R</w:t>
+      </w:r>
+      <w:r>
+        <w:t xml:space="preserve">,</w:t>
+      </w:r>
+      <w:r>
+        <w:t xml:space="preserve"> </w:t>
+      </w:r>
+      <w:r>
+        <w:rPr>
+          <w:rStyle w:val="VerbatimChar"/>
+        </w:rPr>
+        <w:t xml:space="preserve">R/pt_robust_stats.R</w:t>
+      </w:r>
+      <w:r>
+        <w:t xml:space="preserve">,</w:t>
+      </w:r>
+      <w:r>
+        <w:t xml:space="preserve"> </w:t>
+      </w:r>
+      <w:r>
+        <w:rPr>
+          <w:rStyle w:val="VerbatimChar"/>
+        </w:rPr>
+        <w:t xml:space="preserve">R/pt_scores.R</w:t>
+      </w:r>
+      <w:r>
+        <w:t xml:space="preserve">,</w:t>
+      </w:r>
+      <w:r>
+        <w:t xml:space="preserve"> </w:t>
+      </w:r>
+      <w:r>
+        <w:rPr>
+          <w:rStyle w:val="VerbatimChar"/>
+        </w:rPr>
+        <w:t xml:space="preserve">R/utils.R</w:t>
+      </w:r>
+    </w:p>
+    <w:p>
+      <w:pPr>
+        <w:pStyle w:val="Compact"/>
+        <w:numPr>
+          <w:ilvl w:val="0"/>
+          <w:numId w:val="1006"/>
+        </w:numPr>
+      </w:pPr>
+      <w:r>
+        <w:rPr>
+          <w:rStyle w:val="VerbatimChar"/>
+        </w:rPr>
+        <w:t xml:space="preserve">ptcalc/R/pt_homogeneity.R</w:t>
+      </w:r>
+      <w:r>
+        <w:t xml:space="preserve">,</w:t>
+      </w:r>
+      <w:r>
+        <w:t xml:space="preserve"> </w:t>
+      </w:r>
+      <w:r>
+        <w:rPr>
+          <w:rStyle w:val="VerbatimChar"/>
+        </w:rPr>
+        <w:t xml:space="preserve">ptcalc/R/pt_robust_stats.R</w:t>
+      </w:r>
+      <w:r>
+        <w:t xml:space="preserve">,</w:t>
+      </w:r>
+      <w:r>
+        <w:t xml:space="preserve"> </w:t>
+      </w:r>
+      <w:r>
+        <w:rPr>
+          <w:rStyle w:val="VerbatimChar"/>
+        </w:rPr>
+        <w:t xml:space="preserve">ptcalc/R/pt_scores.R</w:t>
+      </w:r>
+    </w:p>
+    <w:p>
+      <w:pPr>
+        <w:pStyle w:val="Compact"/>
+        <w:numPr>
+          <w:ilvl w:val="0"/>
+          <w:numId w:val="1006"/>
+        </w:numPr>
+      </w:pPr>
+      <w:r>
+        <w:rPr>
+          <w:rStyle w:val="VerbatimChar"/>
+        </w:rPr>
+        <w:t xml:space="preserve">reports/report_template.Rmd</w:t>
+      </w:r>
+    </w:p>
+    <w:p>
+      <w:pPr>
+        <w:pStyle w:val="FirstParagraph"/>
+      </w:pPr>
+      <w:r>
+        <w:t xml:space="preserve">Se excluyen scripts de preprocesamiento (</w:t>
+      </w:r>
+      <w:r>
+        <w:rPr>
+          <w:rStyle w:val="VerbatimChar"/>
+        </w:rPr>
+        <w:t xml:space="preserve">R/preprocessing/</w:t>
+      </w:r>
+      <w:r>
+        <w:t xml:space="preserve">) y casos de uso</w:t>
+      </w:r>
+      <w:r>
+        <w:t xml:space="preserve"> </w:t>
+      </w:r>
+      <w:r>
+        <w:t xml:space="preserve">secundarios.</w:t>
+      </w:r>
+    </w:p>
+    <w:bookmarkEnd w:id="18"/>
     <w:bookmarkEnd w:id="19"/>
-    <w:bookmarkStart w:id="22" w:name="formato-de-documentación"/>
+    <w:bookmarkStart w:id="22" w:name="formato-de-documentacion"/>
     <w:p>
       <w:pPr>
         <w:pStyle w:val="Heading2"/>
       </w:pPr>
       <w:r>
-        <w:t xml:space="preserve">Formato de Documentación</w:t>
+        <w:t xml:space="preserve">Formato de Documentacion</w:t>
       </w:r>
     </w:p>
     <w:bookmarkStart w:id="20" w:name="csv-funciones_extraidas.csv"/>
@@ -1200,7 +2289,16 @@
         <w:pStyle w:val="Heading3"/>
       </w:pPr>
       <w:r>
-        <w:t xml:space="preserve">CSV (funciones_extraidas.csv)</w:t>
+        <w:t xml:space="preserve">CSV (</w:t>
+      </w:r>
+      <w:r>
+        <w:rPr>
+          <w:rStyle w:val="VerbatimChar"/>
+        </w:rPr>
+        <w:t xml:space="preserve">funciones_extraidas.csv</w:t>
+      </w:r>
+      <w:r>
+        <w:t xml:space="preserve">)</w:t>
       </w:r>
     </w:p>
     <w:tbl>
@@ -1235,7 +2333,7 @@
               <w:pStyle w:val="Compact"/>
             </w:pPr>
             <w:r>
-              <w:t xml:space="preserve">Descripción</w:t>
+              <w:t xml:space="preserve">Descripcion</w:t>
             </w:r>
           </w:p>
         </w:tc>
@@ -1262,7 +2360,7 @@
               <w:pStyle w:val="Compact"/>
             </w:pPr>
             <w:r>
-              <w:t xml:space="preserve">Archivo donde se define la función</w:t>
+              <w:t xml:space="preserve">Archivo donde se define la funcion</w:t>
             </w:r>
           </w:p>
         </w:tc>
@@ -1289,7 +2387,34 @@
               <w:pStyle w:val="Compact"/>
             </w:pPr>
             <w:r>
-              <w:t xml:space="preserve">Nombre de la función</w:t>
+              <w:t xml:space="preserve">Nombre de la funcion</w:t>
+            </w:r>
+          </w:p>
+        </w:tc>
+      </w:tr>
+      <w:tr>
+        <w:tc>
+          <w:tcPr/>
+          <w:p>
+            <w:pPr>
+              <w:pStyle w:val="Compact"/>
+            </w:pPr>
+            <w:r>
+              <w:rPr>
+                <w:rStyle w:val="VerbatimChar"/>
+              </w:rPr>
+              <w:t xml:space="preserve">categoria</w:t>
+            </w:r>
+          </w:p>
+        </w:tc>
+        <w:tc>
+          <w:tcPr/>
+          <w:p>
+            <w:pPr>
+              <w:pStyle w:val="Compact"/>
+            </w:pPr>
+            <w:r>
+              <w:t xml:space="preserve">Categoria funcional</w:t>
             </w:r>
           </w:p>
         </w:tc>
@@ -1316,7 +2441,7 @@
               <w:pStyle w:val="Compact"/>
             </w:pPr>
             <w:r>
-              <w:t xml:space="preserve">Descripción breve (extraída de roxygen2)</w:t>
+              <w:t xml:space="preserve">Descripcion breve</w:t>
             </w:r>
           </w:p>
         </w:tc>
@@ -1343,7 +2468,7 @@
               <w:pStyle w:val="Compact"/>
             </w:pPr>
             <w:r>
-              <w:t xml:space="preserve">Lista de parámetros</w:t>
+              <w:t xml:space="preserve">Lista de parametros documentados</w:t>
             </w:r>
           </w:p>
         </w:tc>
@@ -1370,7 +2495,34 @@
               <w:pStyle w:val="Compact"/>
             </w:pPr>
             <w:r>
-              <w:t xml:space="preserve">Tipo de retorno (cuando está disponible)</w:t>
+              <w:t xml:space="preserve">Descripcion del valor de retorno</w:t>
+            </w:r>
+          </w:p>
+        </w:tc>
+      </w:tr>
+      <w:tr>
+        <w:tc>
+          <w:tcPr/>
+          <w:p>
+            <w:pPr>
+              <w:pStyle w:val="Compact"/>
+            </w:pPr>
+            <w:r>
+              <w:rPr>
+                <w:rStyle w:val="VerbatimChar"/>
+              </w:rPr>
+              <w:t xml:space="preserve">ejemplos</w:t>
+            </w:r>
+          </w:p>
+        </w:tc>
+        <w:tc>
+          <w:tcPr/>
+          <w:p>
+            <w:pPr>
+              <w:pStyle w:val="Compact"/>
+            </w:pPr>
+            <w:r>
+              <w:t xml:space="preserve">Ejemplo de uso</w:t>
             </w:r>
           </w:p>
         </w:tc>
@@ -1397,20 +2549,140 @@
               <w:pStyle w:val="Compact"/>
             </w:pPr>
             <w:r>
-              <w:t xml:space="preserve">Referencia a estándar ISO</w:t>
+              <w:t xml:space="preserve">Referencia a estandar ISO</w:t>
+            </w:r>
+          </w:p>
+        </w:tc>
+      </w:tr>
+      <w:tr>
+        <w:tc>
+          <w:tcPr/>
+          <w:p>
+            <w:pPr>
+              <w:pStyle w:val="Compact"/>
+            </w:pPr>
+            <w:r>
+              <w:rPr>
+                <w:rStyle w:val="VerbatimChar"/>
+              </w:rPr>
+              <w:t xml:space="preserve">exportada</w:t>
+            </w:r>
+          </w:p>
+        </w:tc>
+        <w:tc>
+          <w:tcPr/>
+          <w:p>
+            <w:pPr>
+              <w:pStyle w:val="Compact"/>
+            </w:pPr>
+            <w:r>
+              <w:rPr>
+                <w:rStyle w:val="VerbatimChar"/>
+              </w:rPr>
+              <w:t xml:space="preserve">TRUE</w:t>
+            </w:r>
+            <w:r>
+              <w:t xml:space="preserve"> </w:t>
+            </w:r>
+            <w:r>
+              <w:t xml:space="preserve">si tiene</w:t>
+            </w:r>
+            <w:r>
+              <w:t xml:space="preserve"> </w:t>
+            </w:r>
+            <w:r>
+              <w:rPr>
+                <w:rStyle w:val="VerbatimChar"/>
+              </w:rPr>
+              <w:t xml:space="preserve">@export</w:t>
+            </w:r>
+          </w:p>
+        </w:tc>
+      </w:tr>
+      <w:tr>
+        <w:tc>
+          <w:tcPr/>
+          <w:p>
+            <w:pPr>
+              <w:pStyle w:val="Compact"/>
+            </w:pPr>
+            <w:r>
+              <w:rPr>
+                <w:rStyle w:val="VerbatimChar"/>
+              </w:rPr>
+              <w:t xml:space="preserve">lifecycle</w:t>
+            </w:r>
+          </w:p>
+        </w:tc>
+        <w:tc>
+          <w:tcPr/>
+          <w:p>
+            <w:pPr>
+              <w:pStyle w:val="Compact"/>
+            </w:pPr>
+            <w:r>
+              <w:t xml:space="preserve">Estado del ciclo de vida (ej.</w:t>
+            </w:r>
+            <w:r>
+              <w:t xml:space="preserve"> </w:t>
+            </w:r>
+            <w:r>
+              <w:rPr>
+                <w:rStyle w:val="VerbatimChar"/>
+              </w:rPr>
+              <w:t xml:space="preserve">deprecated</w:t>
+            </w:r>
+            <w:r>
+              <w:t xml:space="preserve">)</w:t>
+            </w:r>
+          </w:p>
+        </w:tc>
+      </w:tr>
+      <w:tr>
+        <w:tc>
+          <w:tcPr/>
+          <w:p>
+            <w:pPr>
+              <w:pStyle w:val="Compact"/>
+            </w:pPr>
+            <w:r>
+              <w:rPr>
+                <w:rStyle w:val="VerbatimChar"/>
+              </w:rPr>
+              <w:t xml:space="preserve">archivo_ruta</w:t>
+            </w:r>
+          </w:p>
+        </w:tc>
+        <w:tc>
+          <w:tcPr/>
+          <w:p>
+            <w:pPr>
+              <w:pStyle w:val="Compact"/>
+            </w:pPr>
+            <w:r>
+              <w:t xml:space="preserve">Ruta relativa completa del archivo fuente</w:t>
             </w:r>
           </w:p>
         </w:tc>
       </w:tr>
     </w:tbl>
     <w:bookmarkEnd w:id="20"/>
-    <w:bookmarkStart w:id="21" w:name="markdown-documentacion_funciones.md"/>
+    <w:bookmarkStart w:id="21" w:name="markdown-mddocumentacion_funciones.md"/>
     <w:p>
       <w:pPr>
         <w:pStyle w:val="Heading3"/>
       </w:pPr>
       <w:r>
-        <w:t xml:space="preserve">Markdown (documentacion_funciones.md)</w:t>
+        <w:t xml:space="preserve">Markdown (</w:t>
+      </w:r>
+      <w:r>
+        <w:rPr>
+          <w:rStyle w:val="VerbatimChar"/>
+        </w:rPr>
+        <w:t xml:space="preserve">md/documentacion_funciones.md</w:t>
+      </w:r>
+      <w:r>
+        <w:t xml:space="preserve">)</w:t>
       </w:r>
     </w:p>
     <w:p>
@@ -1418,48 +2690,147 @@
         <w:pStyle w:val="FirstParagraph"/>
       </w:pPr>
       <w:r>
-        <w:t xml:space="preserve">Cada función incluye:</w:t>
-      </w:r>
-      <w:r>
-        <w:t xml:space="preserve"> </w:t>
-      </w:r>
-      <w:r>
-        <w:t xml:space="preserve">- Nombre de la función</w:t>
-      </w:r>
-      <w:r>
-        <w:t xml:space="preserve"> </w:t>
-      </w:r>
-      <w:r>
-        <w:t xml:space="preserve">- Descripción</w:t>
-      </w:r>
-      <w:r>
-        <w:t xml:space="preserve"> </w:t>
-      </w:r>
-      <w:r>
-        <w:t xml:space="preserve">- Archivo de origen</w:t>
-      </w:r>
-      <w:r>
-        <w:t xml:space="preserve"> </w:t>
-      </w:r>
-      <w:r>
-        <w:t xml:space="preserve">- Parámetros</w:t>
-      </w:r>
-      <w:r>
-        <w:t xml:space="preserve"> </w:t>
-      </w:r>
-      <w:r>
-        <w:t xml:space="preserve">- Referencia ISO (si aplica)</w:t>
+        <w:t xml:space="preserve">Cada funcion incluye:</w:t>
+      </w:r>
+    </w:p>
+    <w:p>
+      <w:pPr>
+        <w:pStyle w:val="Compact"/>
+        <w:numPr>
+          <w:ilvl w:val="0"/>
+          <w:numId w:val="1007"/>
+        </w:numPr>
+      </w:pPr>
+      <w:r>
+        <w:t xml:space="preserve">Nombre de la funcion y badges (</w:t>
+      </w:r>
+      <w:r>
+        <w:rPr>
+          <w:rStyle w:val="VerbatimChar"/>
+        </w:rPr>
+        <w:t xml:space="preserve">[EXPORTADA]</w:t>
+      </w:r>
+      <w:r>
+        <w:t xml:space="preserve">,</w:t>
+      </w:r>
+      <w:r>
+        <w:t xml:space="preserve"> </w:t>
+      </w:r>
+      <w:r>
+        <w:rPr>
+          <w:rStyle w:val="VerbatimChar"/>
+        </w:rPr>
+        <w:t xml:space="preserve">[OBSOLETO]</w:t>
+      </w:r>
+      <w:r>
+        <w:t xml:space="preserve">)</w:t>
+      </w:r>
+    </w:p>
+    <w:p>
+      <w:pPr>
+        <w:pStyle w:val="Compact"/>
+        <w:numPr>
+          <w:ilvl w:val="0"/>
+          <w:numId w:val="1007"/>
+        </w:numPr>
+      </w:pPr>
+      <w:r>
+        <w:t xml:space="preserve">Descripcion detallada</w:t>
+      </w:r>
+    </w:p>
+    <w:p>
+      <w:pPr>
+        <w:pStyle w:val="Compact"/>
+        <w:numPr>
+          <w:ilvl w:val="0"/>
+          <w:numId w:val="1007"/>
+        </w:numPr>
+      </w:pPr>
+      <w:r>
+        <w:t xml:space="preserve">Firma completa</w:t>
+      </w:r>
+    </w:p>
+    <w:p>
+      <w:pPr>
+        <w:pStyle w:val="Compact"/>
+        <w:numPr>
+          <w:ilvl w:val="0"/>
+          <w:numId w:val="1007"/>
+        </w:numPr>
+      </w:pPr>
+      <w:r>
+        <w:t xml:space="preserve">Parametros con tipos y descripciones</w:t>
+      </w:r>
+    </w:p>
+    <w:p>
+      <w:pPr>
+        <w:pStyle w:val="Compact"/>
+        <w:numPr>
+          <w:ilvl w:val="0"/>
+          <w:numId w:val="1007"/>
+        </w:numPr>
+      </w:pPr>
+      <w:r>
+        <w:t xml:space="preserve">Valor de retorno</w:t>
+      </w:r>
+    </w:p>
+    <w:p>
+      <w:pPr>
+        <w:pStyle w:val="Compact"/>
+        <w:numPr>
+          <w:ilvl w:val="0"/>
+          <w:numId w:val="1007"/>
+        </w:numPr>
+      </w:pPr>
+      <w:r>
+        <w:t xml:space="preserve">Ejemplo ejecutable (cuando esta disponible)</w:t>
+      </w:r>
+    </w:p>
+    <w:p>
+      <w:pPr>
+        <w:pStyle w:val="Compact"/>
+        <w:numPr>
+          <w:ilvl w:val="0"/>
+          <w:numId w:val="1007"/>
+        </w:numPr>
+      </w:pPr>
+      <w:r>
+        <w:t xml:space="preserve">Notas de contexto (cuando aplica)</w:t>
+      </w:r>
+    </w:p>
+    <w:p>
+      <w:pPr>
+        <w:pStyle w:val="Compact"/>
+        <w:numPr>
+          <w:ilvl w:val="0"/>
+          <w:numId w:val="1007"/>
+        </w:numPr>
+      </w:pPr>
+      <w:r>
+        <w:t xml:space="preserve">Archivo fuente</w:t>
+      </w:r>
+    </w:p>
+    <w:p>
+      <w:pPr>
+        <w:pStyle w:val="Compact"/>
+        <w:numPr>
+          <w:ilvl w:val="0"/>
+          <w:numId w:val="1007"/>
+        </w:numPr>
+      </w:pPr>
+      <w:r>
+        <w:t xml:space="preserve">Referencia ISO (si aplica)</w:t>
       </w:r>
     </w:p>
     <w:bookmarkEnd w:id="21"/>
     <w:bookmarkEnd w:id="22"/>
-    <w:bookmarkStart w:id="23" w:name="ejemplo"/>
+    <w:bookmarkStart w:id="23" w:name="ejemplo-de-entrada-en-la-documentacion"/>
     <w:p>
       <w:pPr>
         <w:pStyle w:val="Heading2"/>
       </w:pPr>
       <w:r>
-        <w:t xml:space="preserve">Ejemplo</w:t>
+        <w:t xml:space="preserve">Ejemplo de Entrada en la Documentacion</w:t>
       </w:r>
     </w:p>
     <w:p>
@@ -1470,7 +2841,7 @@
         <w:rPr>
           <w:rStyle w:val="FunctionTok"/>
         </w:rPr>
-        <w:t xml:space="preserve">## `calculate_z_score`</w:t>
+        <w:t xml:space="preserve">### `calculate_z_score` `[EXPORTADA]`</w:t>
       </w:r>
       <w:r>
         <w:br/>
@@ -1482,7 +2853,7 @@
         <w:rPr>
           <w:rStyle w:val="NormalTok"/>
         </w:rPr>
-        <w:t xml:space="preserve">Calcula el puntaje z según ISO 13528:2022</w:t>
+        <w:t xml:space="preserve">Calcula el puntaje z de un participante respecto al valor asignado y sigma_pt.</w:t>
       </w:r>
       <w:r>
         <w:br/>
@@ -1494,13 +2865,13 @@
         <w:rPr>
           <w:rStyle w:val="NormalTok"/>
         </w:rPr>
-        <w:t xml:space="preserve">**Archivo:** </w:t>
+        <w:t xml:space="preserve">**Firma:** </w:t>
       </w:r>
       <w:r>
         <w:rPr>
           <w:rStyle w:val="InformationTok"/>
         </w:rPr>
-        <w:t xml:space="preserve">`pt_scores.R`</w:t>
+        <w:t xml:space="preserve">`calculate_z_score(x, x_pt, sigma_pt)`</w:t>
       </w:r>
       <w:r>
         <w:br/>
@@ -1512,25 +2883,326 @@
         <w:rPr>
           <w:rStyle w:val="NormalTok"/>
         </w:rPr>
-        <w:t xml:space="preserve">**Parámetros:** </w:t>
+        <w:t xml:space="preserve">**Parametros**</w:t>
+      </w:r>
+      <w:r>
+        <w:br/>
+      </w:r>
+      <w:r>
+        <w:br/>
+      </w:r>
+      <w:r>
+        <w:rPr>
+          <w:rStyle w:val="SpecialStringTok"/>
+        </w:rPr>
+        <w:t xml:space="preserve">- </w:t>
+      </w:r>
+      <w:r>
+        <w:rPr>
+          <w:rStyle w:val="NormalTok"/>
+        </w:rPr>
+        <w:t xml:space="preserve">x Resultado del participante.</w:t>
+      </w:r>
+      <w:r>
+        <w:br/>
+      </w:r>
+      <w:r>
+        <w:rPr>
+          <w:rStyle w:val="SpecialStringTok"/>
+        </w:rPr>
+        <w:t xml:space="preserve">- </w:t>
+      </w:r>
+      <w:r>
+        <w:rPr>
+          <w:rStyle w:val="NormalTok"/>
+        </w:rPr>
+        <w:t xml:space="preserve">x_pt Valor asignado.</w:t>
+      </w:r>
+      <w:r>
+        <w:br/>
+      </w:r>
+      <w:r>
+        <w:rPr>
+          <w:rStyle w:val="SpecialStringTok"/>
+        </w:rPr>
+        <w:t xml:space="preserve">- </w:t>
+      </w:r>
+      <w:r>
+        <w:rPr>
+          <w:rStyle w:val="NormalTok"/>
+        </w:rPr>
+        <w:t xml:space="preserve">sigma_pt Desviacion estandar para la evaluacion de aptitud.</w:t>
+      </w:r>
+      <w:r>
+        <w:br/>
+      </w:r>
+      <w:r>
+        <w:br/>
+      </w:r>
+      <w:r>
+        <w:rPr>
+          <w:rStyle w:val="NormalTok"/>
+        </w:rPr>
+        <w:t xml:space="preserve">**Valor de retorno**</w:t>
+      </w:r>
+      <w:r>
+        <w:br/>
+      </w:r>
+      <w:r>
+        <w:br/>
+      </w:r>
+      <w:r>
+        <w:rPr>
+          <w:rStyle w:val="NormalTok"/>
+        </w:rPr>
+        <w:t xml:space="preserve">Valor numerico del puntaje z o NA si sigma_pt no es valido.</w:t>
+      </w:r>
+      <w:r>
+        <w:br/>
+      </w:r>
+      <w:r>
+        <w:br/>
+      </w:r>
+      <w:r>
+        <w:rPr>
+          <w:rStyle w:val="NormalTok"/>
+        </w:rPr>
+        <w:t xml:space="preserve">**Ejemplo**</w:t>
+      </w:r>
+      <w:r>
+        <w:br/>
+      </w:r>
+      <w:r>
+        <w:br/>
       </w:r>
       <w:r>
         <w:rPr>
           <w:rStyle w:val="InformationTok"/>
         </w:rPr>
-        <w:t xml:space="preserve">`x, x_pt, sigma_pt`</w:t>
+        <w:t xml:space="preserve">```r</w:t>
       </w:r>
       <w:r>
         <w:br/>
       </w:r>
       <w:r>
+        <w:rPr>
+          <w:rStyle w:val="NormalTok"/>
+        </w:rPr>
+        <w:t xml:space="preserve">z </w:t>
+      </w:r>
+      <w:r>
+        <w:rPr>
+          <w:rStyle w:val="OtherTok"/>
+        </w:rPr>
+        <w:t xml:space="preserve">&lt;-</w:t>
+      </w:r>
+      <w:r>
+        <w:rPr>
+          <w:rStyle w:val="NormalTok"/>
+        </w:rPr>
+        <w:t xml:space="preserve"> </w:t>
+      </w:r>
+      <w:r>
+        <w:rPr>
+          <w:rStyle w:val="FunctionTok"/>
+        </w:rPr>
+        <w:t xml:space="preserve">calculate_z_score</w:t>
+      </w:r>
+      <w:r>
+        <w:rPr>
+          <w:rStyle w:val="NormalTok"/>
+        </w:rPr>
+        <w:t xml:space="preserve">(</w:t>
+      </w:r>
+      <w:r>
+        <w:rPr>
+          <w:rStyle w:val="AttributeTok"/>
+        </w:rPr>
+        <w:t xml:space="preserve">x =</w:t>
+      </w:r>
+      <w:r>
+        <w:rPr>
+          <w:rStyle w:val="NormalTok"/>
+        </w:rPr>
+        <w:t xml:space="preserve"> </w:t>
+      </w:r>
+      <w:r>
+        <w:rPr>
+          <w:rStyle w:val="FloatTok"/>
+        </w:rPr>
+        <w:t xml:space="preserve">10.5</w:t>
+      </w:r>
+      <w:r>
+        <w:rPr>
+          <w:rStyle w:val="NormalTok"/>
+        </w:rPr>
+        <w:t xml:space="preserve">, </w:t>
+      </w:r>
+      <w:r>
+        <w:rPr>
+          <w:rStyle w:val="AttributeTok"/>
+        </w:rPr>
+        <w:t xml:space="preserve">x_pt =</w:t>
+      </w:r>
+      <w:r>
+        <w:rPr>
+          <w:rStyle w:val="NormalTok"/>
+        </w:rPr>
+        <w:t xml:space="preserve"> </w:t>
+      </w:r>
+      <w:r>
+        <w:rPr>
+          <w:rStyle w:val="FloatTok"/>
+        </w:rPr>
+        <w:t xml:space="preserve">10.0</w:t>
+      </w:r>
+      <w:r>
+        <w:rPr>
+          <w:rStyle w:val="NormalTok"/>
+        </w:rPr>
+        <w:t xml:space="preserve">, </w:t>
+      </w:r>
+      <w:r>
+        <w:rPr>
+          <w:rStyle w:val="AttributeTok"/>
+        </w:rPr>
+        <w:t xml:space="preserve">sigma_pt =</w:t>
+      </w:r>
+      <w:r>
+        <w:rPr>
+          <w:rStyle w:val="NormalTok"/>
+        </w:rPr>
+        <w:t xml:space="preserve"> </w:t>
+      </w:r>
+      <w:r>
+        <w:rPr>
+          <w:rStyle w:val="FloatTok"/>
+        </w:rPr>
+        <w:t xml:space="preserve">0.5</w:t>
+      </w:r>
+      <w:r>
+        <w:rPr>
+          <w:rStyle w:val="NormalTok"/>
+        </w:rPr>
+        <w:t xml:space="preserve">)</w:t>
+      </w:r>
+    </w:p>
+    <w:p>
+      <w:pPr>
+        <w:pStyle w:val="FirstParagraph"/>
+      </w:pPr>
+      <w:r>
+        <w:rPr>
+          <w:b/>
+          <w:bCs/>
+        </w:rPr>
+        <w:t xml:space="preserve">Archivo fuente:</w:t>
+      </w:r>
+      <w:r>
+        <w:t xml:space="preserve"> </w:t>
+      </w:r>
+      <w:r>
+        <w:rPr>
+          <w:rStyle w:val="VerbatimChar"/>
+        </w:rPr>
+        <w:t xml:space="preserve">ptcalc/R/pt_scores.R</w:t>
+      </w:r>
+    </w:p>
+    <w:p>
+      <w:pPr>
+        <w:pStyle w:val="BodyText"/>
+      </w:pPr>
+      <w:r>
+        <w:rPr>
+          <w:b/>
+          <w:bCs/>
+        </w:rPr>
+        <w:t xml:space="preserve">Referencia ISO:</w:t>
+      </w:r>
+      <w:r>
+        <w:t xml:space="preserve"> </w:t>
+      </w:r>
+      <w:r>
+        <w:t xml:space="preserve">ISO 13528:2022, Section 10.2</w:t>
+      </w:r>
+    </w:p>
+    <w:p>
+      <w:pPr>
+        <w:pStyle w:val="SourceCode"/>
+      </w:pPr>
+      <w:r>
         <w:br/>
       </w:r>
       <w:r>
         <w:rPr>
-          <w:rStyle w:val="NormalTok"/>
-        </w:rPr>
-        <w:t xml:space="preserve">**Referencia ISO:** ISO 13528:2022, Section 10.2</w:t>
+          <w:rStyle w:val="VerbatimChar"/>
+        </w:rPr>
+        <w:t xml:space="preserve">## Pruebas</w:t>
+      </w:r>
+      <w:r>
+        <w:br/>
+      </w:r>
+      <w:r>
+        <w:br/>
+      </w:r>
+      <w:r>
+        <w:rPr>
+          <w:rStyle w:val="VerbatimChar"/>
+        </w:rPr>
+        <w:t xml:space="preserve">Para ejecutar el test de firmas:</w:t>
+      </w:r>
+      <w:r>
+        <w:br/>
+      </w:r>
+      <w:r>
+        <w:br/>
+      </w:r>
+      <w:r>
+        <w:rPr>
+          <w:rStyle w:val="VerbatimChar"/>
+        </w:rPr>
+        <w:t xml:space="preserve">```r</w:t>
+      </w:r>
+      <w:r>
+        <w:br/>
+      </w:r>
+      <w:r>
+        <w:rPr>
+          <w:rStyle w:val="VerbatimChar"/>
+        </w:rPr>
+        <w:t xml:space="preserve">source("Entregables_pt_app/02_funciones_usadas/tests/test_02_firma_funciones.R")</w:t>
+      </w:r>
+    </w:p>
+    <w:p>
+      <w:pPr>
+        <w:pStyle w:val="FirstParagraph"/>
+      </w:pPr>
+      <w:r>
+        <w:t xml:space="preserve">El test valida que:</w:t>
+      </w:r>
+    </w:p>
+    <w:p>
+      <w:pPr>
+        <w:pStyle w:val="Compact"/>
+        <w:numPr>
+          <w:ilvl w:val="0"/>
+          <w:numId w:val="1008"/>
+        </w:numPr>
+      </w:pPr>
+      <w:r>
+        <w:t xml:space="preserve">Todas las funciones registradas en el CSV existan en los entornos cargados.</w:t>
+      </w:r>
+    </w:p>
+    <w:p>
+      <w:pPr>
+        <w:pStyle w:val="Compact"/>
+        <w:numPr>
+          <w:ilvl w:val="0"/>
+          <w:numId w:val="1008"/>
+        </w:numPr>
+      </w:pPr>
+      <w:r>
+        <w:t xml:space="preserve">Los argumentos de cada funcion coincidan con la firma documentada.</w:t>
       </w:r>
     </w:p>
     <w:bookmarkEnd w:id="23"/>
@@ -1548,15 +3220,15 @@
         <w:pStyle w:val="FirstParagraph"/>
       </w:pPr>
       <w:r>
-        <w:t xml:space="preserve">Este entregable proporciona el inventario necesario para:</w:t>
-      </w:r>
-    </w:p>
-    <w:p>
-      <w:pPr>
-        <w:pStyle w:val="Compact"/>
-        <w:numPr>
-          <w:ilvl w:val="0"/>
-          <w:numId w:val="1006"/>
+        <w:t xml:space="preserve">Este entregable enriquecido alimenta:</w:t>
+      </w:r>
+    </w:p>
+    <w:p>
+      <w:pPr>
+        <w:pStyle w:val="Compact"/>
+        <w:numPr>
+          <w:ilvl w:val="0"/>
+          <w:numId w:val="1009"/>
         </w:numPr>
       </w:pPr>
       <w:r>
@@ -1570,15 +3242,15 @@
         <w:t xml:space="preserve"> </w:t>
       </w:r>
       <w:r>
-        <w:t xml:space="preserve">Implementar funciones standalone para cálculos PT</w:t>
-      </w:r>
-    </w:p>
-    <w:p>
-      <w:pPr>
-        <w:pStyle w:val="Compact"/>
-        <w:numPr>
-          <w:ilvl w:val="0"/>
-          <w:numId w:val="1006"/>
+        <w:t xml:space="preserve">Implementacion de funciones standalone para calculos PT.</w:t>
+      </w:r>
+    </w:p>
+    <w:p>
+      <w:pPr>
+        <w:pStyle w:val="Compact"/>
+        <w:numPr>
+          <w:ilvl w:val="0"/>
+          <w:numId w:val="1009"/>
         </w:numPr>
       </w:pPr>
       <w:r>
@@ -1592,15 +3264,15 @@
         <w:t xml:space="preserve"> </w:t>
       </w:r>
       <w:r>
-        <w:t xml:space="preserve">Implementar módulo de cálculo de puntajes</w:t>
-      </w:r>
-    </w:p>
-    <w:p>
-      <w:pPr>
-        <w:pStyle w:val="Compact"/>
-        <w:numPr>
-          <w:ilvl w:val="0"/>
-          <w:numId w:val="1006"/>
+        <w:t xml:space="preserve">Modulo de calculo de puntajes.</w:t>
+      </w:r>
+    </w:p>
+    <w:p>
+      <w:pPr>
+        <w:pStyle w:val="Compact"/>
+        <w:numPr>
+          <w:ilvl w:val="0"/>
+          <w:numId w:val="1009"/>
         </w:numPr>
       </w:pPr>
       <w:r>
@@ -1614,7 +3286,7 @@
         <w:t xml:space="preserve"> </w:t>
       </w:r>
       <w:r>
-        <w:t xml:space="preserve">Documentación final para desarrolladores</w:t>
+        <w:t xml:space="preserve">Documentacion final para desarrolladores.</w:t>
       </w:r>
     </w:p>
     <w:bookmarkEnd w:id="24"/>
@@ -1632,7 +3304,7 @@
         <w:pStyle w:val="Compact"/>
         <w:numPr>
           <w:ilvl w:val="0"/>
-          <w:numId w:val="1007"/>
+          <w:numId w:val="1010"/>
         </w:numPr>
       </w:pPr>
       <w:r>
@@ -1654,7 +3326,7 @@
         <w:pStyle w:val="Compact"/>
         <w:numPr>
           <w:ilvl w:val="0"/>
-          <w:numId w:val="1007"/>
+          <w:numId w:val="1010"/>
         </w:numPr>
       </w:pPr>
       <w:r>
@@ -1676,7 +3348,7 @@
         <w:pStyle w:val="Compact"/>
         <w:numPr>
           <w:ilvl w:val="0"/>
-          <w:numId w:val="1007"/>
+          <w:numId w:val="1010"/>
         </w:numPr>
       </w:pPr>
       <w:r>
@@ -1690,7 +3362,7 @@
         <w:t xml:space="preserve"> </w:t>
       </w:r>
       <w:r>
-        <w:t xml:space="preserve">- Guía de estilo y convenciones del código</w:t>
+        <w:t xml:space="preserve">- Guia de estilo y convenciones del codigo</w:t>
       </w:r>
     </w:p>
     <w:bookmarkEnd w:id="25"/>
@@ -2009,9 +3681,6 @@
     <w:abstractNumId w:val="991"/>
   </w:num>
   <w:num w:numId="1005">
-    <w:abstractNumId w:val="991"/>
-  </w:num>
-  <w:num w:numId="1006">
     <w:abstractNumId w:val="99411"/>
     <w:lvlOverride w:ilvl="0">
       <w:startOverride w:val="1"/>
@@ -2041,7 +3710,73 @@
       <w:startOverride w:val="1"/>
     </w:lvlOverride>
   </w:num>
+  <w:num w:numId="1006">
+    <w:abstractNumId w:val="991"/>
+  </w:num>
   <w:num w:numId="1007">
+    <w:abstractNumId w:val="991"/>
+  </w:num>
+  <w:num w:numId="1008">
+    <w:abstractNumId w:val="99411"/>
+    <w:lvlOverride w:ilvl="0">
+      <w:startOverride w:val="1"/>
+    </w:lvlOverride>
+    <w:lvlOverride w:ilvl="1">
+      <w:startOverride w:val="1"/>
+    </w:lvlOverride>
+    <w:lvlOverride w:ilvl="2">
+      <w:startOverride w:val="1"/>
+    </w:lvlOverride>
+    <w:lvlOverride w:ilvl="3">
+      <w:startOverride w:val="1"/>
+    </w:lvlOverride>
+    <w:lvlOverride w:ilvl="4">
+      <w:startOverride w:val="1"/>
+    </w:lvlOverride>
+    <w:lvlOverride w:ilvl="5">
+      <w:startOverride w:val="1"/>
+    </w:lvlOverride>
+    <w:lvlOverride w:ilvl="6">
+      <w:startOverride w:val="1"/>
+    </w:lvlOverride>
+    <w:lvlOverride w:ilvl="7">
+      <w:startOverride w:val="1"/>
+    </w:lvlOverride>
+    <w:lvlOverride w:ilvl="8">
+      <w:startOverride w:val="1"/>
+    </w:lvlOverride>
+  </w:num>
+  <w:num w:numId="1009">
+    <w:abstractNumId w:val="99411"/>
+    <w:lvlOverride w:ilvl="0">
+      <w:startOverride w:val="1"/>
+    </w:lvlOverride>
+    <w:lvlOverride w:ilvl="1">
+      <w:startOverride w:val="1"/>
+    </w:lvlOverride>
+    <w:lvlOverride w:ilvl="2">
+      <w:startOverride w:val="1"/>
+    </w:lvlOverride>
+    <w:lvlOverride w:ilvl="3">
+      <w:startOverride w:val="1"/>
+    </w:lvlOverride>
+    <w:lvlOverride w:ilvl="4">
+      <w:startOverride w:val="1"/>
+    </w:lvlOverride>
+    <w:lvlOverride w:ilvl="5">
+      <w:startOverride w:val="1"/>
+    </w:lvlOverride>
+    <w:lvlOverride w:ilvl="6">
+      <w:startOverride w:val="1"/>
+    </w:lvlOverride>
+    <w:lvlOverride w:ilvl="7">
+      <w:startOverride w:val="1"/>
+    </w:lvlOverride>
+    <w:lvlOverride w:ilvl="8">
+      <w:startOverride w:val="1"/>
+    </w:lvlOverride>
+  </w:num>
+  <w:num w:numId="1010">
     <w:abstractNumId w:val="991"/>
   </w:num>
 </w:numbering>

</xml_diff>